<commit_message>
[US_MI][Workflows] Add n/a check box to scc form (Recidiviz/recidiviz-dashboards#10248)
GitOrigin-RevId: 86cf457211743eb800d765bd785b4b5119c472d9
</commit_message>
<xml_diff>
--- a/libs/staff-shared-server/src/server/assets/workflowsTemplates/US_MI/scc_review_template.docx
+++ b/libs/staff-shared-server/src/server/assets/workflowsTemplates/US_MI/scc_review_template.docx
@@ -1,6 +1,6 @@
 
 <file path=word/document.xml><?xml version="1.0" encoding="utf-8"?>
-<w:document xmlns:wpc="http://schemas.microsoft.com/office/word/2010/wordprocessingCanvas" xmlns:cx="http://schemas.microsoft.com/office/drawing/2014/chartex" xmlns:cx1="http://schemas.microsoft.com/office/drawing/2015/9/8/chartex" xmlns:cx2="http://schemas.microsoft.com/office/drawing/2015/10/21/chartex" xmlns:cx3="http://schemas.microsoft.com/office/drawing/2016/5/9/chartex" xmlns:cx4="http://schemas.microsoft.com/office/drawing/2016/5/10/chartex" xmlns:cx5="http://schemas.microsoft.com/office/drawing/2016/5/11/chartex" xmlns:cx6="http://schemas.microsoft.com/office/drawing/2016/5/12/chartex" xmlns:cx7="http://schemas.microsoft.com/office/drawing/2016/5/13/chartex" xmlns:cx8="http://schemas.microsoft.com/office/drawing/2016/5/14/chartex" xmlns:mc="http://schemas.openxmlformats.org/markup-compatibility/2006" xmlns:aink="http://schemas.microsoft.com/office/drawing/2016/ink" xmlns:am3d="http://schemas.microsoft.com/office/drawing/2017/model3d" xmlns:o="urn:schemas-microsoft-com:office:office" xmlns:oel="http://schemas.microsoft.com/office/2019/extlst" xmlns:r="http://schemas.openxmlformats.org/officeDocument/2006/relationships" xmlns:m="http://schemas.openxmlformats.org/officeDocument/2006/math" xmlns:v="urn:schemas-microsoft-com:vml" xmlns:wp14="http://schemas.microsoft.com/office/word/2010/wordprocessingDrawing" xmlns:wp="http://schemas.openxmlformats.org/drawingml/2006/wordprocessingDrawing" xmlns:w10="urn:schemas-microsoft-com:office:word" xmlns:w="http://schemas.openxmlformats.org/wordprocessingml/2006/main" xmlns:w14="http://schemas.microsoft.com/office/word/2010/wordml" xmlns:w15="http://schemas.microsoft.com/office/word/2012/wordml" xmlns:w16cex="http://schemas.microsoft.com/office/word/2018/wordml/cex" xmlns:w16cid="http://schemas.microsoft.com/office/word/2016/wordml/cid" xmlns:w16="http://schemas.microsoft.com/office/word/2018/wordml" xmlns:w16sdtdh="http://schemas.microsoft.com/office/word/2020/wordml/sdtdatahash" xmlns:w16se="http://schemas.microsoft.com/office/word/2015/wordml/symex" xmlns:wpg="http://schemas.microsoft.com/office/word/2010/wordprocessingGroup" xmlns:wpi="http://schemas.microsoft.com/office/word/2010/wordprocessingInk" xmlns:wne="http://schemas.microsoft.com/office/word/2006/wordml" xmlns:wps="http://schemas.microsoft.com/office/word/2010/wordprocessingShape" mc:Ignorable="w14 w15 w16se w16cid w16 w16cex w16sdtdh wp14">
+<w:document xmlns:wpc="http://schemas.microsoft.com/office/word/2010/wordprocessingCanvas" xmlns:cx="http://schemas.microsoft.com/office/drawing/2014/chartex" xmlns:cx1="http://schemas.microsoft.com/office/drawing/2015/9/8/chartex" xmlns:cx2="http://schemas.microsoft.com/office/drawing/2015/10/21/chartex" xmlns:cx3="http://schemas.microsoft.com/office/drawing/2016/5/9/chartex" xmlns:cx4="http://schemas.microsoft.com/office/drawing/2016/5/10/chartex" xmlns:cx5="http://schemas.microsoft.com/office/drawing/2016/5/11/chartex" xmlns:cx6="http://schemas.microsoft.com/office/drawing/2016/5/12/chartex" xmlns:cx7="http://schemas.microsoft.com/office/drawing/2016/5/13/chartex" xmlns:cx8="http://schemas.microsoft.com/office/drawing/2016/5/14/chartex" xmlns:mc="http://schemas.openxmlformats.org/markup-compatibility/2006" xmlns:aink="http://schemas.microsoft.com/office/drawing/2016/ink" xmlns:am3d="http://schemas.microsoft.com/office/drawing/2017/model3d" xmlns:o="urn:schemas-microsoft-com:office:office" xmlns:oel="http://schemas.microsoft.com/office/2019/extlst" xmlns:r="http://schemas.openxmlformats.org/officeDocument/2006/relationships" xmlns:m="http://schemas.openxmlformats.org/officeDocument/2006/math" xmlns:v="urn:schemas-microsoft-com:vml" xmlns:wp14="http://schemas.microsoft.com/office/word/2010/wordprocessingDrawing" xmlns:wp="http://schemas.openxmlformats.org/drawingml/2006/wordprocessingDrawing" xmlns:w10="urn:schemas-microsoft-com:office:word" xmlns:w="http://schemas.openxmlformats.org/wordprocessingml/2006/main" xmlns:w14="http://schemas.microsoft.com/office/word/2010/wordml" xmlns:w15="http://schemas.microsoft.com/office/word/2012/wordml" xmlns:w16cex="http://schemas.microsoft.com/office/word/2018/wordml/cex" xmlns:w16cid="http://schemas.microsoft.com/office/word/2016/wordml/cid" xmlns:w16="http://schemas.microsoft.com/office/word/2018/wordml" xmlns:w16du="http://schemas.microsoft.com/office/word/2023/wordml/word16du" xmlns:w16sdtdh="http://schemas.microsoft.com/office/word/2020/wordml/sdtdatahash" xmlns:w16sdtfl="http://schemas.microsoft.com/office/word/2024/wordml/sdtformatlock" xmlns:w16se="http://schemas.microsoft.com/office/word/2015/wordml/symex" xmlns:wpg="http://schemas.microsoft.com/office/word/2010/wordprocessingGroup" xmlns:wpi="http://schemas.microsoft.com/office/word/2010/wordprocessingInk" xmlns:wne="http://schemas.microsoft.com/office/word/2006/wordml" xmlns:wps="http://schemas.microsoft.com/office/word/2010/wordprocessingShape" mc:Ignorable="w14 w15 w16se w16cid w16 w16cex w16sdtdh w16sdtfl w16du wp14">
   <w:body>
     <w:tbl>
       <w:tblPr>
@@ -219,7 +219,16 @@
                 <w:sz w:val="16"/>
                 <w:szCs w:val="16"/>
               </w:rPr>
-              <w:t xml:space="preserve">Review Type:   </w:t>
+              <w:t>Review Type:</w:t>
+            </w:r>
+            <w:proofErr w:type="gramStart"/>
+            <w:r>
+              <w:rPr>
+                <w:rFonts w:ascii="Arial" w:eastAsia="Arial" w:hAnsi="Arial" w:cs="Arial"/>
+                <w:sz w:val="16"/>
+                <w:szCs w:val="16"/>
+              </w:rPr>
+              <w:t xml:space="preserve">   </w:t>
             </w:r>
             <w:r>
               <w:rPr>
@@ -230,6 +239,7 @@
               <w:t>{</w:t>
             </w:r>
             <w:proofErr w:type="spellStart"/>
+            <w:proofErr w:type="gramEnd"/>
             <w:r>
               <w:rPr>
                 <w:rFonts w:ascii="Courier New" w:eastAsia="Courier New" w:hAnsi="Courier New" w:cs="Courier New"/>
@@ -1005,7 +1015,25 @@
                 <w:sz w:val="16"/>
                 <w:szCs w:val="16"/>
               </w:rPr>
-              <w:t>{/}{^</w:t>
+              <w:t>{</w:t>
+            </w:r>
+            <w:proofErr w:type="gramStart"/>
+            <w:r>
+              <w:rPr>
+                <w:rFonts w:ascii="Arial" w:hAnsi="Arial" w:cs="Arial"/>
+                <w:sz w:val="16"/>
+                <w:szCs w:val="16"/>
+              </w:rPr>
+              <w:t>/}{</w:t>
+            </w:r>
+            <w:proofErr w:type="gramEnd"/>
+            <w:r>
+              <w:rPr>
+                <w:rFonts w:ascii="Arial" w:hAnsi="Arial" w:cs="Arial"/>
+                <w:sz w:val="16"/>
+                <w:szCs w:val="16"/>
+              </w:rPr>
+              <w:t>^</w:t>
             </w:r>
             <w:r>
               <w:rPr>
@@ -1071,6 +1099,7 @@
               </w:rPr>
               <w:t>Yes</w:t>
             </w:r>
+            <w:proofErr w:type="gramStart"/>
             <w:r>
               <w:rPr>
                 <w:rFonts w:ascii="Arial" w:eastAsia="Arial" w:hAnsi="Arial" w:cs="Arial"/>
@@ -1087,7 +1116,16 @@
                 <w:sz w:val="16"/>
                 <w:szCs w:val="16"/>
               </w:rPr>
-              <w:t>{#</w:t>
+              <w:t>{</w:t>
+            </w:r>
+            <w:proofErr w:type="gramEnd"/>
+            <w:r>
+              <w:rPr>
+                <w:rFonts w:ascii="Arial" w:hAnsi="Arial" w:cs="Arial"/>
+                <w:sz w:val="16"/>
+                <w:szCs w:val="16"/>
+              </w:rPr>
+              <w:t>#</w:t>
             </w:r>
             <w:r>
               <w:rPr>
@@ -1135,7 +1173,25 @@
                 <w:sz w:val="16"/>
                 <w:szCs w:val="16"/>
               </w:rPr>
-              <w:t>{/}{^</w:t>
+              <w:t>{</w:t>
+            </w:r>
+            <w:proofErr w:type="gramStart"/>
+            <w:r>
+              <w:rPr>
+                <w:rFonts w:ascii="Arial" w:hAnsi="Arial" w:cs="Arial"/>
+                <w:sz w:val="16"/>
+                <w:szCs w:val="16"/>
+              </w:rPr>
+              <w:t>/}{</w:t>
+            </w:r>
+            <w:proofErr w:type="gramEnd"/>
+            <w:r>
+              <w:rPr>
+                <w:rFonts w:ascii="Arial" w:hAnsi="Arial" w:cs="Arial"/>
+                <w:sz w:val="16"/>
+                <w:szCs w:val="16"/>
+              </w:rPr>
+              <w:t>^</w:t>
             </w:r>
             <w:r>
               <w:rPr>
@@ -1283,7 +1339,25 @@
                 <w:sz w:val="16"/>
                 <w:szCs w:val="16"/>
               </w:rPr>
-              <w:t>{/}{^</w:t>
+              <w:t>{</w:t>
+            </w:r>
+            <w:proofErr w:type="gramStart"/>
+            <w:r>
+              <w:rPr>
+                <w:rFonts w:ascii="Arial" w:hAnsi="Arial" w:cs="Arial"/>
+                <w:sz w:val="16"/>
+                <w:szCs w:val="16"/>
+              </w:rPr>
+              <w:t>/}{</w:t>
+            </w:r>
+            <w:proofErr w:type="gramEnd"/>
+            <w:r>
+              <w:rPr>
+                <w:rFonts w:ascii="Arial" w:hAnsi="Arial" w:cs="Arial"/>
+                <w:sz w:val="16"/>
+                <w:szCs w:val="16"/>
+              </w:rPr>
+              <w:t>^</w:t>
             </w:r>
             <w:proofErr w:type="spellStart"/>
             <w:r>
@@ -1333,7 +1407,16 @@
                 <w:sz w:val="16"/>
                 <w:szCs w:val="16"/>
               </w:rPr>
-              <w:t>{/}</w:t>
+              <w:t>{</w:t>
+            </w:r>
+            <w:proofErr w:type="gramStart"/>
+            <w:r>
+              <w:rPr>
+                <w:rFonts w:ascii="Arial" w:hAnsi="Arial" w:cs="Arial"/>
+                <w:sz w:val="16"/>
+                <w:szCs w:val="16"/>
+              </w:rPr>
+              <w:t>/}</w:t>
             </w:r>
             <w:permEnd w:id="253631426"/>
             <w:r>
@@ -1351,6 +1434,7 @@
               </w:rPr>
               <w:t xml:space="preserve"> Administrative</w:t>
             </w:r>
+            <w:proofErr w:type="gramEnd"/>
             <w:r>
               <w:rPr>
                 <w:rFonts w:ascii="Arial" w:eastAsia="Arial" w:hAnsi="Arial" w:cs="Arial"/>
@@ -1374,23 +1458,42 @@
                 <w:sz w:val="13"/>
                 <w:szCs w:val="13"/>
               </w:rPr>
-              <w:t>{#adminSeg}{</w:t>
-            </w:r>
+              <w:t>{#</w:t>
+            </w:r>
+            <w:proofErr w:type="gramStart"/>
             <w:r>
               <w:rPr>
                 <w:rFonts w:ascii="Courier New" w:eastAsia="Courier New" w:hAnsi="Courier New" w:cs="Courier New"/>
                 <w:sz w:val="13"/>
                 <w:szCs w:val="13"/>
               </w:rPr>
-              <w:t>adminSeg</w:t>
-            </w:r>
+              <w:t>adminSeg}{</w:t>
+            </w:r>
+            <w:proofErr w:type="gramEnd"/>
             <w:r>
               <w:rPr>
                 <w:rFonts w:ascii="Courier New" w:eastAsia="Courier New" w:hAnsi="Courier New" w:cs="Courier New"/>
                 <w:sz w:val="13"/>
                 <w:szCs w:val="13"/>
               </w:rPr>
-              <w:t>Date}{/}</w:t>
+              <w:t>adminSeg</w:t>
+            </w:r>
+            <w:r>
+              <w:rPr>
+                <w:rFonts w:ascii="Courier New" w:eastAsia="Courier New" w:hAnsi="Courier New" w:cs="Courier New"/>
+                <w:sz w:val="13"/>
+                <w:szCs w:val="13"/>
+              </w:rPr>
+              <w:t>Date</w:t>
+            </w:r>
+            <w:proofErr w:type="gramStart"/>
+            <w:r>
+              <w:rPr>
+                <w:rFonts w:ascii="Courier New" w:eastAsia="Courier New" w:hAnsi="Courier New" w:cs="Courier New"/>
+                <w:sz w:val="13"/>
+                <w:szCs w:val="13"/>
+              </w:rPr>
+              <w:t>}{/}</w:t>
             </w:r>
             <w:r>
               <w:rPr>
@@ -1402,6 +1505,7 @@
             </w:r>
             <w:bookmarkStart w:id="1" w:name="bookmark=id.3znysh7" w:colFirst="0" w:colLast="0"/>
             <w:bookmarkEnd w:id="1"/>
+            <w:proofErr w:type="gramEnd"/>
             <w:r>
               <w:rPr>
                 <w:rFonts w:ascii="Courier New" w:eastAsia="Courier New" w:hAnsi="Courier New" w:cs="Courier New"/>
@@ -1496,7 +1600,25 @@
                 <w:sz w:val="16"/>
                 <w:szCs w:val="16"/>
               </w:rPr>
-              <w:t>{/}{^</w:t>
+              <w:t>{</w:t>
+            </w:r>
+            <w:proofErr w:type="gramStart"/>
+            <w:r>
+              <w:rPr>
+                <w:rFonts w:ascii="Arial" w:hAnsi="Arial" w:cs="Arial"/>
+                <w:sz w:val="16"/>
+                <w:szCs w:val="16"/>
+              </w:rPr>
+              <w:t>/}{</w:t>
+            </w:r>
+            <w:proofErr w:type="gramEnd"/>
+            <w:r>
+              <w:rPr>
+                <w:rFonts w:ascii="Arial" w:hAnsi="Arial" w:cs="Arial"/>
+                <w:sz w:val="16"/>
+                <w:szCs w:val="16"/>
+              </w:rPr>
+              <w:t>^</w:t>
             </w:r>
             <w:proofErr w:type="spellStart"/>
             <w:r>
@@ -1546,7 +1668,16 @@
                 <w:sz w:val="16"/>
                 <w:szCs w:val="16"/>
               </w:rPr>
-              <w:t>{/}</w:t>
+              <w:t>{</w:t>
+            </w:r>
+            <w:proofErr w:type="gramStart"/>
+            <w:r>
+              <w:rPr>
+                <w:rFonts w:ascii="Arial" w:hAnsi="Arial" w:cs="Arial"/>
+                <w:sz w:val="16"/>
+                <w:szCs w:val="16"/>
+              </w:rPr>
+              <w:t>/}</w:t>
             </w:r>
             <w:permEnd w:id="1993110695"/>
             <w:r>
@@ -1562,7 +1693,16 @@
                 <w:sz w:val="16"/>
                 <w:szCs w:val="16"/>
               </w:rPr>
-              <w:t xml:space="preserve">  Punitive:  Date Placed In: </w:t>
+              <w:t xml:space="preserve">  </w:t>
+            </w:r>
+            <w:proofErr w:type="gramEnd"/>
+            <w:r>
+              <w:rPr>
+                <w:rFonts w:ascii="Arial" w:eastAsia="Arial" w:hAnsi="Arial" w:cs="Arial"/>
+                <w:sz w:val="16"/>
+                <w:szCs w:val="16"/>
+              </w:rPr>
+              <w:t xml:space="preserve">Punitive:  Date Placed In: </w:t>
             </w:r>
             <w:r>
               <w:rPr>
@@ -1570,23 +1710,25 @@
                 <w:sz w:val="13"/>
                 <w:szCs w:val="13"/>
               </w:rPr>
-              <w:t>{#punSeg}{</w:t>
-            </w:r>
+              <w:t>{#</w:t>
+            </w:r>
+            <w:proofErr w:type="gramStart"/>
             <w:r>
               <w:rPr>
                 <w:rFonts w:ascii="Courier New" w:eastAsia="Courier New" w:hAnsi="Courier New" w:cs="Courier New"/>
                 <w:sz w:val="13"/>
                 <w:szCs w:val="13"/>
               </w:rPr>
-              <w:t>punSeg</w:t>
-            </w:r>
+              <w:t>punSeg}{</w:t>
+            </w:r>
+            <w:proofErr w:type="gramEnd"/>
             <w:r>
               <w:rPr>
                 <w:rFonts w:ascii="Courier New" w:eastAsia="Courier New" w:hAnsi="Courier New" w:cs="Courier New"/>
                 <w:sz w:val="13"/>
                 <w:szCs w:val="13"/>
               </w:rPr>
-              <w:t>Date</w:t>
+              <w:t>punSeg</w:t>
             </w:r>
             <w:r>
               <w:rPr>
@@ -1594,7 +1736,25 @@
                 <w:sz w:val="13"/>
                 <w:szCs w:val="13"/>
               </w:rPr>
-              <w:t>}{/}     </w:t>
+              <w:t>Date</w:t>
+            </w:r>
+            <w:proofErr w:type="gramStart"/>
+            <w:r>
+              <w:rPr>
+                <w:rFonts w:ascii="Courier New" w:eastAsia="Courier New" w:hAnsi="Courier New" w:cs="Courier New"/>
+                <w:sz w:val="13"/>
+                <w:szCs w:val="13"/>
+              </w:rPr>
+              <w:t>}{/}   </w:t>
+            </w:r>
+            <w:proofErr w:type="gramEnd"/>
+            <w:r>
+              <w:rPr>
+                <w:rFonts w:ascii="Courier New" w:eastAsia="Courier New" w:hAnsi="Courier New" w:cs="Courier New"/>
+                <w:sz w:val="13"/>
+                <w:szCs w:val="13"/>
+              </w:rPr>
+              <w:t>  </w:t>
             </w:r>
           </w:p>
         </w:tc>
@@ -1684,6 +1844,7 @@
               <w:t>{/</w:t>
             </w:r>
             <w:proofErr w:type="spellStart"/>
+            <w:proofErr w:type="gramStart"/>
             <w:r>
               <w:rPr>
                 <w:rFonts w:ascii="Arial" w:hAnsi="Arial" w:cs="Arial"/>
@@ -1699,7 +1860,16 @@
                 <w:sz w:val="16"/>
                 <w:szCs w:val="16"/>
               </w:rPr>
-              <w:t>}{^</w:t>
+              <w:t>}{</w:t>
+            </w:r>
+            <w:proofErr w:type="gramEnd"/>
+            <w:r>
+              <w:rPr>
+                <w:rFonts w:ascii="Arial" w:hAnsi="Arial" w:cs="Arial"/>
+                <w:sz w:val="16"/>
+                <w:szCs w:val="16"/>
+              </w:rPr>
+              <w:t>^</w:t>
             </w:r>
             <w:proofErr w:type="spellStart"/>
             <w:r>
@@ -1752,6 +1922,7 @@
               <w:t>{/</w:t>
             </w:r>
             <w:proofErr w:type="spellStart"/>
+            <w:proofErr w:type="gramStart"/>
             <w:r>
               <w:rPr>
                 <w:rFonts w:ascii="Arial" w:hAnsi="Arial" w:cs="Arial"/>
@@ -1783,7 +1954,16 @@
                 <w:sz w:val="16"/>
                 <w:szCs w:val="16"/>
               </w:rPr>
-              <w:t xml:space="preserve">  Temporary:  Date Placed In: </w:t>
+              <w:t xml:space="preserve">  </w:t>
+            </w:r>
+            <w:proofErr w:type="gramEnd"/>
+            <w:r>
+              <w:rPr>
+                <w:rFonts w:ascii="Arial" w:eastAsia="Arial" w:hAnsi="Arial" w:cs="Arial"/>
+                <w:sz w:val="16"/>
+                <w:szCs w:val="16"/>
+              </w:rPr>
+              <w:t xml:space="preserve">Temporary:  Date Placed In: </w:t>
             </w:r>
             <w:r>
               <w:rPr>
@@ -1791,23 +1971,25 @@
                 <w:sz w:val="13"/>
                 <w:szCs w:val="13"/>
               </w:rPr>
-              <w:t>{#tempSeg}{</w:t>
-            </w:r>
+              <w:t>{#</w:t>
+            </w:r>
+            <w:proofErr w:type="gramStart"/>
             <w:r>
               <w:rPr>
                 <w:rFonts w:ascii="Courier New" w:eastAsia="Courier New" w:hAnsi="Courier New" w:cs="Courier New"/>
                 <w:sz w:val="13"/>
                 <w:szCs w:val="13"/>
               </w:rPr>
-              <w:t>tempSeg</w:t>
-            </w:r>
+              <w:t>tempSeg}{</w:t>
+            </w:r>
+            <w:proofErr w:type="gramEnd"/>
             <w:r>
               <w:rPr>
                 <w:rFonts w:ascii="Courier New" w:eastAsia="Courier New" w:hAnsi="Courier New" w:cs="Courier New"/>
                 <w:sz w:val="13"/>
                 <w:szCs w:val="13"/>
               </w:rPr>
-              <w:t>Date}{/</w:t>
+              <w:t>tempSeg</w:t>
             </w:r>
             <w:r>
               <w:rPr>
@@ -1815,14 +1997,23 @@
                 <w:sz w:val="13"/>
                 <w:szCs w:val="13"/>
               </w:rPr>
-              <w:t>tempSeg</w:t>
-            </w:r>
+              <w:t>Date}{/</w:t>
+            </w:r>
+            <w:proofErr w:type="gramStart"/>
             <w:r>
               <w:rPr>
                 <w:rFonts w:ascii="Courier New" w:eastAsia="Courier New" w:hAnsi="Courier New" w:cs="Courier New"/>
                 <w:sz w:val="13"/>
                 <w:szCs w:val="13"/>
               </w:rPr>
+              <w:t>tempSeg</w:t>
+            </w:r>
+            <w:r>
+              <w:rPr>
+                <w:rFonts w:ascii="Courier New" w:eastAsia="Courier New" w:hAnsi="Courier New" w:cs="Courier New"/>
+                <w:sz w:val="13"/>
+                <w:szCs w:val="13"/>
+              </w:rPr>
               <w:t>}</w:t>
             </w:r>
             <w:r>
@@ -1838,7 +2029,16 @@
                 <w:sz w:val="16"/>
                 <w:szCs w:val="16"/>
               </w:rPr>
-              <w:t xml:space="preserve">   </w:t>
+              <w:t xml:space="preserve">  </w:t>
+            </w:r>
+            <w:proofErr w:type="gramEnd"/>
+            <w:r>
+              <w:rPr>
+                <w:rFonts w:ascii="Arial" w:eastAsia="Arial" w:hAnsi="Arial" w:cs="Arial"/>
+                <w:sz w:val="16"/>
+                <w:szCs w:val="16"/>
+              </w:rPr>
+              <w:t xml:space="preserve"> </w:t>
             </w:r>
           </w:p>
         </w:tc>
@@ -1883,6 +2083,7 @@
               <w:t>{</w:t>
             </w:r>
             <w:proofErr w:type="spellStart"/>
+            <w:proofErr w:type="gramStart"/>
             <w:r>
               <w:rPr>
                 <w:rFonts w:ascii="Courier New" w:eastAsia="Courier New" w:hAnsi="Courier New" w:cs="Courier New"/>
@@ -1918,6 +2119,7 @@
               </w:rPr>
               <w:t xml:space="preserve"> </w:t>
             </w:r>
+            <w:proofErr w:type="gramEnd"/>
           </w:p>
         </w:tc>
       </w:tr>
@@ -2998,7 +3200,25 @@
                 <w:sz w:val="16"/>
                 <w:szCs w:val="16"/>
               </w:rPr>
-              <w:t>{/}{^</w:t>
+              <w:t>{</w:t>
+            </w:r>
+            <w:proofErr w:type="gramStart"/>
+            <w:r>
+              <w:rPr>
+                <w:rFonts w:ascii="Arial" w:hAnsi="Arial" w:cs="Arial"/>
+                <w:sz w:val="16"/>
+                <w:szCs w:val="16"/>
+              </w:rPr>
+              <w:t>/}{</w:t>
+            </w:r>
+            <w:proofErr w:type="gramEnd"/>
+            <w:r>
+              <w:rPr>
+                <w:rFonts w:ascii="Arial" w:hAnsi="Arial" w:cs="Arial"/>
+                <w:sz w:val="16"/>
+                <w:szCs w:val="16"/>
+              </w:rPr>
+              <w:t>^</w:t>
             </w:r>
             <w:r>
               <w:rPr>
@@ -3046,7 +3266,16 @@
                 <w:sz w:val="16"/>
                 <w:szCs w:val="16"/>
               </w:rPr>
-              <w:t>{/}</w:t>
+              <w:t>{</w:t>
+            </w:r>
+            <w:proofErr w:type="gramStart"/>
+            <w:r>
+              <w:rPr>
+                <w:rFonts w:ascii="Arial" w:hAnsi="Arial" w:cs="Arial"/>
+                <w:sz w:val="16"/>
+                <w:szCs w:val="16"/>
+              </w:rPr>
+              <w:t>/}</w:t>
             </w:r>
             <w:permEnd w:id="1512845053"/>
             <w:r>
@@ -3064,6 +3293,7 @@
               </w:rPr>
               <w:t xml:space="preserve"> I</w:t>
             </w:r>
+            <w:proofErr w:type="gramEnd"/>
             <w:r>
               <w:rPr>
                 <w:rFonts w:ascii="Arial" w:eastAsia="Arial" w:hAnsi="Arial" w:cs="Arial"/>
@@ -3129,7 +3359,25 @@
                 <w:sz w:val="16"/>
                 <w:szCs w:val="16"/>
               </w:rPr>
-              <w:t>{/}{^</w:t>
+              <w:t>{</w:t>
+            </w:r>
+            <w:proofErr w:type="gramStart"/>
+            <w:r>
+              <w:rPr>
+                <w:rFonts w:ascii="Arial" w:hAnsi="Arial" w:cs="Arial"/>
+                <w:sz w:val="16"/>
+                <w:szCs w:val="16"/>
+              </w:rPr>
+              <w:t>/}{</w:t>
+            </w:r>
+            <w:proofErr w:type="gramEnd"/>
+            <w:r>
+              <w:rPr>
+                <w:rFonts w:ascii="Arial" w:hAnsi="Arial" w:cs="Arial"/>
+                <w:sz w:val="16"/>
+                <w:szCs w:val="16"/>
+              </w:rPr>
+              <w:t>^</w:t>
             </w:r>
             <w:r>
               <w:rPr>
@@ -3177,7 +3425,16 @@
                 <w:sz w:val="16"/>
                 <w:szCs w:val="16"/>
               </w:rPr>
-              <w:t>{/}</w:t>
+              <w:t>{</w:t>
+            </w:r>
+            <w:proofErr w:type="gramStart"/>
+            <w:r>
+              <w:rPr>
+                <w:rFonts w:ascii="Arial" w:hAnsi="Arial" w:cs="Arial"/>
+                <w:sz w:val="16"/>
+                <w:szCs w:val="16"/>
+              </w:rPr>
+              <w:t>/}</w:t>
             </w:r>
             <w:permEnd w:id="643183433"/>
             <w:r>
@@ -3202,6 +3459,171 @@
                 <w:szCs w:val="16"/>
               </w:rPr>
               <w:t xml:space="preserve"> II</w:t>
+            </w:r>
+            <w:r>
+              <w:rPr>
+                <w:rFonts w:ascii="Arial" w:eastAsia="Arial" w:hAnsi="Arial" w:cs="Arial"/>
+                <w:sz w:val="16"/>
+                <w:szCs w:val="16"/>
+              </w:rPr>
+              <w:t xml:space="preserve">  </w:t>
+            </w:r>
+            <w:permStart w:id="1164839851" w:edGrp="everyone"/>
+            <w:r>
+              <w:rPr>
+                <w:rFonts w:ascii="Arial" w:hAnsi="Arial" w:cs="Arial"/>
+                <w:sz w:val="16"/>
+                <w:szCs w:val="16"/>
+              </w:rPr>
+              <w:t>{</w:t>
+            </w:r>
+            <w:proofErr w:type="gramEnd"/>
+            <w:r>
+              <w:rPr>
+                <w:rFonts w:ascii="Arial" w:hAnsi="Arial" w:cs="Arial"/>
+                <w:sz w:val="16"/>
+                <w:szCs w:val="16"/>
+              </w:rPr>
+              <w:t>#</w:t>
+            </w:r>
+            <w:r>
+              <w:rPr>
+                <w:rFonts w:ascii="Arial" w:hAnsi="Arial" w:cs="Arial"/>
+                <w:sz w:val="16"/>
+                <w:szCs w:val="16"/>
+              </w:rPr>
+              <w:t>STG_</w:t>
+            </w:r>
+            <w:r>
+              <w:rPr>
+                <w:rFonts w:ascii="Arial" w:hAnsi="Arial" w:cs="Arial"/>
+                <w:sz w:val="16"/>
+                <w:szCs w:val="16"/>
+              </w:rPr>
+              <w:t>NA</w:t>
+            </w:r>
+            <w:r>
+              <w:rPr>
+                <w:rFonts w:ascii="Arial" w:hAnsi="Arial" w:cs="Arial"/>
+                <w:sz w:val="16"/>
+                <w:szCs w:val="16"/>
+              </w:rPr>
+              <w:t>}</w:t>
+            </w:r>
+            <w:sdt>
+              <w:sdtPr>
+                <w:rPr>
+                  <w:sz w:val="18"/>
+                  <w:szCs w:val="18"/>
+                </w:rPr>
+                <w:id w:val="-973146186"/>
+                <w14:checkbox>
+                  <w14:checked w14:val="1"/>
+                  <w14:checkedState w14:val="2612" w14:font="MS Gothic"/>
+                  <w14:uncheckedState w14:val="2610" w14:font="MS Gothic"/>
+                </w14:checkbox>
+              </w:sdtPr>
+              <w:sdtContent>
+                <w:r>
+                  <w:rPr>
+                    <w:rFonts w:ascii="MS Gothic" w:eastAsia="MS Gothic" w:hAnsi="MS Gothic" w:hint="eastAsia"/>
+                    <w:sz w:val="18"/>
+                    <w:szCs w:val="18"/>
+                  </w:rPr>
+                  <w:t>☒</w:t>
+                </w:r>
+              </w:sdtContent>
+            </w:sdt>
+            <w:r>
+              <w:rPr>
+                <w:rFonts w:ascii="Arial" w:hAnsi="Arial" w:cs="Arial"/>
+                <w:sz w:val="16"/>
+                <w:szCs w:val="16"/>
+              </w:rPr>
+              <w:t>{</w:t>
+            </w:r>
+            <w:proofErr w:type="gramStart"/>
+            <w:r>
+              <w:rPr>
+                <w:rFonts w:ascii="Arial" w:hAnsi="Arial" w:cs="Arial"/>
+                <w:sz w:val="16"/>
+                <w:szCs w:val="16"/>
+              </w:rPr>
+              <w:t>/}{</w:t>
+            </w:r>
+            <w:proofErr w:type="gramEnd"/>
+            <w:r>
+              <w:rPr>
+                <w:rFonts w:ascii="Arial" w:hAnsi="Arial" w:cs="Arial"/>
+                <w:sz w:val="16"/>
+                <w:szCs w:val="16"/>
+              </w:rPr>
+              <w:t>^</w:t>
+            </w:r>
+            <w:r>
+              <w:rPr>
+                <w:rFonts w:ascii="Arial" w:hAnsi="Arial" w:cs="Arial"/>
+                <w:sz w:val="16"/>
+                <w:szCs w:val="16"/>
+              </w:rPr>
+              <w:t>STG_</w:t>
+            </w:r>
+            <w:r>
+              <w:rPr>
+                <w:rFonts w:ascii="Arial" w:hAnsi="Arial" w:cs="Arial"/>
+                <w:sz w:val="16"/>
+                <w:szCs w:val="16"/>
+              </w:rPr>
+              <w:t>NA</w:t>
+            </w:r>
+            <w:r>
+              <w:rPr>
+                <w:rFonts w:ascii="Arial" w:hAnsi="Arial" w:cs="Arial"/>
+                <w:sz w:val="16"/>
+                <w:szCs w:val="16"/>
+              </w:rPr>
+              <w:t>}</w:t>
+            </w:r>
+            <w:sdt>
+              <w:sdtPr>
+                <w:rPr>
+                  <w:sz w:val="18"/>
+                  <w:szCs w:val="18"/>
+                </w:rPr>
+                <w:id w:val="-2103865508"/>
+                <w14:checkbox>
+                  <w14:checked w14:val="0"/>
+                  <w14:checkedState w14:val="2612" w14:font="MS Gothic"/>
+                  <w14:uncheckedState w14:val="2610" w14:font="MS Gothic"/>
+                </w14:checkbox>
+              </w:sdtPr>
+              <w:sdtContent>
+                <w:r>
+                  <w:rPr>
+                    <w:rFonts w:ascii="MS Gothic" w:eastAsia="MS Gothic" w:hAnsi="MS Gothic" w:hint="eastAsia"/>
+                    <w:sz w:val="18"/>
+                    <w:szCs w:val="18"/>
+                  </w:rPr>
+                  <w:t>☐</w:t>
+                </w:r>
+              </w:sdtContent>
+            </w:sdt>
+            <w:r>
+              <w:rPr>
+                <w:rFonts w:ascii="Arial" w:hAnsi="Arial" w:cs="Arial"/>
+                <w:sz w:val="16"/>
+                <w:szCs w:val="16"/>
+              </w:rPr>
+              <w:t>{/}</w:t>
+            </w:r>
+            <w:permEnd w:id="1164839851"/>
+            <w:r>
+              <w:rPr>
+                <w:rFonts w:ascii="Arial" w:eastAsia="Arial" w:hAnsi="Arial" w:cs="Arial"/>
+                <w:sz w:val="16"/>
+                <w:szCs w:val="16"/>
+              </w:rPr>
+              <w:t xml:space="preserve"> N/A</w:t>
             </w:r>
           </w:p>
         </w:tc>
@@ -3616,6 +4038,14 @@
                 <w:sz w:val="16"/>
                 <w:szCs w:val="16"/>
               </w:rPr>
+              <w:t>APPROVAL_</w:t>
+            </w:r>
+            <w:r>
+              <w:rPr>
+                <w:rFonts w:ascii="Arial" w:hAnsi="Arial" w:cs="Arial"/>
+                <w:sz w:val="16"/>
+                <w:szCs w:val="16"/>
+              </w:rPr>
               <w:t>NA</w:t>
             </w:r>
             <w:r>
@@ -3664,6 +4094,14 @@
                 <w:sz w:val="16"/>
                 <w:szCs w:val="16"/>
               </w:rPr>
+              <w:t>APPROVAL_</w:t>
+            </w:r>
+            <w:r>
+              <w:rPr>
+                <w:rFonts w:ascii="Arial" w:hAnsi="Arial" w:cs="Arial"/>
+                <w:sz w:val="16"/>
+                <w:szCs w:val="16"/>
+              </w:rPr>
               <w:t>NA</w:t>
             </w:r>
             <w:r>
@@ -3756,7 +4194,16 @@
                 <w:sz w:val="16"/>
                 <w:szCs w:val="16"/>
               </w:rPr>
-              <w:t xml:space="preserve">Date of Last Warden Interview:  </w:t>
+              <w:t>Date of Last Warden Interview</w:t>
+            </w:r>
+            <w:proofErr w:type="gramStart"/>
+            <w:r>
+              <w:rPr>
+                <w:rFonts w:ascii="Arial" w:eastAsia="Arial" w:hAnsi="Arial" w:cs="Arial"/>
+                <w:sz w:val="16"/>
+                <w:szCs w:val="16"/>
+              </w:rPr>
+              <w:t xml:space="preserve">:  </w:t>
             </w:r>
             <w:r>
               <w:rPr>
@@ -3767,6 +4214,7 @@
               <w:t>{</w:t>
             </w:r>
             <w:proofErr w:type="spellStart"/>
+            <w:proofErr w:type="gramEnd"/>
             <w:r>
               <w:rPr>
                 <w:rFonts w:ascii="Courier New" w:eastAsia="Courier New" w:hAnsi="Courier New" w:cs="Courier New"/>
@@ -3995,7 +4443,16 @@
                 <w:sz w:val="16"/>
                 <w:szCs w:val="16"/>
               </w:rPr>
-              <w:t xml:space="preserve">N/A  </w:t>
+              <w:t>N/</w:t>
+            </w:r>
+            <w:proofErr w:type="gramStart"/>
+            <w:r>
+              <w:rPr>
+                <w:rFonts w:ascii="Arial" w:eastAsia="Arial" w:hAnsi="Arial" w:cs="Arial"/>
+                <w:sz w:val="16"/>
+                <w:szCs w:val="16"/>
+              </w:rPr>
+              <w:t xml:space="preserve">A  </w:t>
             </w:r>
             <w:permStart w:id="884475301" w:edGrp="everyone"/>
             <w:r>
@@ -4004,7 +4461,16 @@
                 <w:sz w:val="16"/>
                 <w:szCs w:val="16"/>
               </w:rPr>
-              <w:t>{#</w:t>
+              <w:t>{</w:t>
+            </w:r>
+            <w:proofErr w:type="gramEnd"/>
+            <w:r>
+              <w:rPr>
+                <w:rFonts w:ascii="Arial" w:hAnsi="Arial" w:cs="Arial"/>
+                <w:sz w:val="16"/>
+                <w:szCs w:val="16"/>
+              </w:rPr>
+              <w:t>#</w:t>
             </w:r>
             <w:r>
               <w:rPr>
@@ -4052,7 +4518,25 @@
                 <w:sz w:val="16"/>
                 <w:szCs w:val="16"/>
               </w:rPr>
-              <w:t>{/}{^</w:t>
+              <w:t>{</w:t>
+            </w:r>
+            <w:proofErr w:type="gramStart"/>
+            <w:r>
+              <w:rPr>
+                <w:rFonts w:ascii="Arial" w:hAnsi="Arial" w:cs="Arial"/>
+                <w:sz w:val="16"/>
+                <w:szCs w:val="16"/>
+              </w:rPr>
+              <w:t>/}{</w:t>
+            </w:r>
+            <w:proofErr w:type="gramEnd"/>
+            <w:r>
+              <w:rPr>
+                <w:rFonts w:ascii="Arial" w:hAnsi="Arial" w:cs="Arial"/>
+                <w:sz w:val="16"/>
+                <w:szCs w:val="16"/>
+              </w:rPr>
+              <w:t>^</w:t>
             </w:r>
             <w:r>
               <w:rPr>
@@ -4995,7 +5479,16 @@
                 <w:sz w:val="16"/>
                 <w:szCs w:val="16"/>
               </w:rPr>
-              <w:t xml:space="preserve">Print Name)  </w:t>
+              <w:t xml:space="preserve">Print </w:t>
+            </w:r>
+            <w:proofErr w:type="gramStart"/>
+            <w:r>
+              <w:rPr>
+                <w:rFonts w:ascii="Arial" w:eastAsia="Arial" w:hAnsi="Arial" w:cs="Arial"/>
+                <w:sz w:val="16"/>
+                <w:szCs w:val="16"/>
+              </w:rPr>
+              <w:t xml:space="preserve">Name)  </w:t>
             </w:r>
             <w:r>
               <w:rPr>
@@ -5006,6 +5499,7 @@
               <w:t>{</w:t>
             </w:r>
             <w:proofErr w:type="spellStart"/>
+            <w:proofErr w:type="gramEnd"/>
             <w:r>
               <w:rPr>
                 <w:rFonts w:ascii="Courier New" w:eastAsia="Courier New" w:hAnsi="Courier New" w:cs="Courier New"/>
@@ -5257,7 +5751,25 @@
                 <w:sz w:val="16"/>
                 <w:szCs w:val="16"/>
               </w:rPr>
-              <w:t>{/}{^</w:t>
+              <w:t>{</w:t>
+            </w:r>
+            <w:proofErr w:type="gramStart"/>
+            <w:r>
+              <w:rPr>
+                <w:rFonts w:ascii="Arial" w:hAnsi="Arial" w:cs="Arial"/>
+                <w:sz w:val="16"/>
+                <w:szCs w:val="16"/>
+              </w:rPr>
+              <w:t>/}{</w:t>
+            </w:r>
+            <w:proofErr w:type="gramEnd"/>
+            <w:r>
+              <w:rPr>
+                <w:rFonts w:ascii="Arial" w:hAnsi="Arial" w:cs="Arial"/>
+                <w:sz w:val="16"/>
+                <w:szCs w:val="16"/>
+              </w:rPr>
+              <w:t>^</w:t>
             </w:r>
             <w:r>
               <w:rPr>
@@ -5316,6 +5828,7 @@
               </w:rPr>
               <w:t xml:space="preserve"> </w:t>
             </w:r>
+            <w:proofErr w:type="gramStart"/>
             <w:r>
               <w:rPr>
                 <w:rFonts w:ascii="Arial" w:eastAsia="Arial" w:hAnsi="Arial" w:cs="Arial"/>
@@ -5331,7 +5844,16 @@
                 <w:sz w:val="16"/>
                 <w:szCs w:val="16"/>
               </w:rPr>
-              <w:t>{#</w:t>
+              <w:t>{</w:t>
+            </w:r>
+            <w:proofErr w:type="gramEnd"/>
+            <w:r>
+              <w:rPr>
+                <w:rFonts w:ascii="Arial" w:hAnsi="Arial" w:cs="Arial"/>
+                <w:sz w:val="16"/>
+                <w:szCs w:val="16"/>
+              </w:rPr>
+              <w:t>#</w:t>
             </w:r>
             <w:r>
               <w:rPr>
@@ -5379,7 +5901,25 @@
                 <w:sz w:val="16"/>
                 <w:szCs w:val="16"/>
               </w:rPr>
-              <w:t>{/}{^</w:t>
+              <w:t>{</w:t>
+            </w:r>
+            <w:proofErr w:type="gramStart"/>
+            <w:r>
+              <w:rPr>
+                <w:rFonts w:ascii="Arial" w:hAnsi="Arial" w:cs="Arial"/>
+                <w:sz w:val="16"/>
+                <w:szCs w:val="16"/>
+              </w:rPr>
+              <w:t>/}{</w:t>
+            </w:r>
+            <w:proofErr w:type="gramEnd"/>
+            <w:r>
+              <w:rPr>
+                <w:rFonts w:ascii="Arial" w:hAnsi="Arial" w:cs="Arial"/>
+                <w:sz w:val="16"/>
+                <w:szCs w:val="16"/>
+              </w:rPr>
+              <w:t>^</w:t>
             </w:r>
             <w:r>
               <w:rPr>
@@ -5438,6 +5978,7 @@
               </w:rPr>
               <w:t xml:space="preserve"> </w:t>
             </w:r>
+            <w:proofErr w:type="gramStart"/>
             <w:r>
               <w:rPr>
                 <w:rFonts w:ascii="Arial" w:eastAsia="Arial" w:hAnsi="Arial" w:cs="Arial"/>
@@ -5453,7 +5994,16 @@
                 <w:sz w:val="16"/>
                 <w:szCs w:val="16"/>
               </w:rPr>
-              <w:t>{#</w:t>
+              <w:t>{</w:t>
+            </w:r>
+            <w:proofErr w:type="gramEnd"/>
+            <w:r>
+              <w:rPr>
+                <w:rFonts w:ascii="Arial" w:hAnsi="Arial" w:cs="Arial"/>
+                <w:sz w:val="16"/>
+                <w:szCs w:val="16"/>
+              </w:rPr>
+              <w:t>#</w:t>
             </w:r>
             <w:r>
               <w:rPr>
@@ -5501,7 +6051,25 @@
                 <w:sz w:val="16"/>
                 <w:szCs w:val="16"/>
               </w:rPr>
-              <w:t>{/}{^</w:t>
+              <w:t>{</w:t>
+            </w:r>
+            <w:proofErr w:type="gramStart"/>
+            <w:r>
+              <w:rPr>
+                <w:rFonts w:ascii="Arial" w:hAnsi="Arial" w:cs="Arial"/>
+                <w:sz w:val="16"/>
+                <w:szCs w:val="16"/>
+              </w:rPr>
+              <w:t>/}{</w:t>
+            </w:r>
+            <w:proofErr w:type="gramEnd"/>
+            <w:r>
+              <w:rPr>
+                <w:rFonts w:ascii="Arial" w:hAnsi="Arial" w:cs="Arial"/>
+                <w:sz w:val="16"/>
+                <w:szCs w:val="16"/>
+              </w:rPr>
+              <w:t>^</w:t>
             </w:r>
             <w:r>
               <w:rPr>
@@ -5566,7 +6134,16 @@
                 <w:sz w:val="16"/>
                 <w:szCs w:val="16"/>
               </w:rPr>
-              <w:t xml:space="preserve">Sometimes  </w:t>
+              <w:t>Sometimes</w:t>
+            </w:r>
+            <w:proofErr w:type="gramStart"/>
+            <w:r>
+              <w:rPr>
+                <w:rFonts w:ascii="Arial" w:eastAsia="Arial" w:hAnsi="Arial" w:cs="Arial"/>
+                <w:sz w:val="16"/>
+                <w:szCs w:val="16"/>
+              </w:rPr>
+              <w:t xml:space="preserve">  </w:t>
             </w:r>
             <w:r>
               <w:rPr>
@@ -5583,7 +6160,16 @@
                 <w:sz w:val="16"/>
                 <w:szCs w:val="16"/>
               </w:rPr>
-              <w:t>{#</w:t>
+              <w:t>{</w:t>
+            </w:r>
+            <w:proofErr w:type="gramEnd"/>
+            <w:r>
+              <w:rPr>
+                <w:rFonts w:ascii="Arial" w:hAnsi="Arial" w:cs="Arial"/>
+                <w:sz w:val="16"/>
+                <w:szCs w:val="16"/>
+              </w:rPr>
+              <w:t>#</w:t>
             </w:r>
             <w:r>
               <w:rPr>
@@ -5631,7 +6217,25 @@
                 <w:sz w:val="16"/>
                 <w:szCs w:val="16"/>
               </w:rPr>
-              <w:t>{/}{^</w:t>
+              <w:t>{</w:t>
+            </w:r>
+            <w:proofErr w:type="gramStart"/>
+            <w:r>
+              <w:rPr>
+                <w:rFonts w:ascii="Arial" w:hAnsi="Arial" w:cs="Arial"/>
+                <w:sz w:val="16"/>
+                <w:szCs w:val="16"/>
+              </w:rPr>
+              <w:t>/}{</w:t>
+            </w:r>
+            <w:proofErr w:type="gramEnd"/>
+            <w:r>
+              <w:rPr>
+                <w:rFonts w:ascii="Arial" w:hAnsi="Arial" w:cs="Arial"/>
+                <w:sz w:val="16"/>
+                <w:szCs w:val="16"/>
+              </w:rPr>
+              <w:t>^</w:t>
             </w:r>
             <w:r>
               <w:rPr>
@@ -5775,7 +6379,25 @@
                 <w:sz w:val="16"/>
                 <w:szCs w:val="16"/>
               </w:rPr>
-              <w:t>{/}{^</w:t>
+              <w:t>{</w:t>
+            </w:r>
+            <w:proofErr w:type="gramStart"/>
+            <w:r>
+              <w:rPr>
+                <w:rFonts w:ascii="Arial" w:hAnsi="Arial" w:cs="Arial"/>
+                <w:sz w:val="16"/>
+                <w:szCs w:val="16"/>
+              </w:rPr>
+              <w:t>/}{</w:t>
+            </w:r>
+            <w:proofErr w:type="gramEnd"/>
+            <w:r>
+              <w:rPr>
+                <w:rFonts w:ascii="Arial" w:hAnsi="Arial" w:cs="Arial"/>
+                <w:sz w:val="16"/>
+                <w:szCs w:val="16"/>
+              </w:rPr>
+              <w:t>^</w:t>
             </w:r>
             <w:r>
               <w:rPr>
@@ -5834,6 +6456,7 @@
               </w:rPr>
               <w:t xml:space="preserve"> </w:t>
             </w:r>
+            <w:proofErr w:type="gramStart"/>
             <w:r>
               <w:rPr>
                 <w:rFonts w:ascii="Arial" w:eastAsia="Arial" w:hAnsi="Arial" w:cs="Arial"/>
@@ -5849,7 +6472,16 @@
                 <w:sz w:val="16"/>
                 <w:szCs w:val="16"/>
               </w:rPr>
-              <w:t>{#</w:t>
+              <w:t>{</w:t>
+            </w:r>
+            <w:proofErr w:type="gramEnd"/>
+            <w:r>
+              <w:rPr>
+                <w:rFonts w:ascii="Arial" w:hAnsi="Arial" w:cs="Arial"/>
+                <w:sz w:val="16"/>
+                <w:szCs w:val="16"/>
+              </w:rPr>
+              <w:t>#</w:t>
             </w:r>
             <w:r>
               <w:rPr>
@@ -5897,7 +6529,25 @@
                 <w:sz w:val="16"/>
                 <w:szCs w:val="16"/>
               </w:rPr>
-              <w:t>{/}{^</w:t>
+              <w:t>{</w:t>
+            </w:r>
+            <w:proofErr w:type="gramStart"/>
+            <w:r>
+              <w:rPr>
+                <w:rFonts w:ascii="Arial" w:hAnsi="Arial" w:cs="Arial"/>
+                <w:sz w:val="16"/>
+                <w:szCs w:val="16"/>
+              </w:rPr>
+              <w:t>/}{</w:t>
+            </w:r>
+            <w:proofErr w:type="gramEnd"/>
+            <w:r>
+              <w:rPr>
+                <w:rFonts w:ascii="Arial" w:hAnsi="Arial" w:cs="Arial"/>
+                <w:sz w:val="16"/>
+                <w:szCs w:val="16"/>
+              </w:rPr>
+              <w:t>^</w:t>
             </w:r>
             <w:r>
               <w:rPr>
@@ -5962,7 +6612,16 @@
                 <w:sz w:val="16"/>
                 <w:szCs w:val="16"/>
               </w:rPr>
-              <w:t xml:space="preserve">Rarely  </w:t>
+              <w:t>Rarely</w:t>
+            </w:r>
+            <w:proofErr w:type="gramStart"/>
+            <w:r>
+              <w:rPr>
+                <w:rFonts w:ascii="Arial" w:eastAsia="Arial" w:hAnsi="Arial" w:cs="Arial"/>
+                <w:sz w:val="16"/>
+                <w:szCs w:val="16"/>
+              </w:rPr>
+              <w:t xml:space="preserve">  </w:t>
             </w:r>
             <w:r>
               <w:rPr>
@@ -5979,7 +6638,16 @@
                 <w:sz w:val="16"/>
                 <w:szCs w:val="16"/>
               </w:rPr>
-              <w:t>{#</w:t>
+              <w:t>{</w:t>
+            </w:r>
+            <w:proofErr w:type="gramEnd"/>
+            <w:r>
+              <w:rPr>
+                <w:rFonts w:ascii="Arial" w:hAnsi="Arial" w:cs="Arial"/>
+                <w:sz w:val="16"/>
+                <w:szCs w:val="16"/>
+              </w:rPr>
+              <w:t>#</w:t>
             </w:r>
             <w:r>
               <w:rPr>
@@ -6027,7 +6695,25 @@
                 <w:sz w:val="16"/>
                 <w:szCs w:val="16"/>
               </w:rPr>
-              <w:t>{/}{^</w:t>
+              <w:t>{</w:t>
+            </w:r>
+            <w:proofErr w:type="gramStart"/>
+            <w:r>
+              <w:rPr>
+                <w:rFonts w:ascii="Arial" w:hAnsi="Arial" w:cs="Arial"/>
+                <w:sz w:val="16"/>
+                <w:szCs w:val="16"/>
+              </w:rPr>
+              <w:t>/}{</w:t>
+            </w:r>
+            <w:proofErr w:type="gramEnd"/>
+            <w:r>
+              <w:rPr>
+                <w:rFonts w:ascii="Arial" w:hAnsi="Arial" w:cs="Arial"/>
+                <w:sz w:val="16"/>
+                <w:szCs w:val="16"/>
+              </w:rPr>
+              <w:t>^</w:t>
             </w:r>
             <w:r>
               <w:rPr>
@@ -6092,7 +6778,16 @@
                 <w:sz w:val="16"/>
                 <w:szCs w:val="16"/>
               </w:rPr>
-              <w:t xml:space="preserve">Sometimes  </w:t>
+              <w:t>Sometimes</w:t>
+            </w:r>
+            <w:proofErr w:type="gramStart"/>
+            <w:r>
+              <w:rPr>
+                <w:rFonts w:ascii="Arial" w:eastAsia="Arial" w:hAnsi="Arial" w:cs="Arial"/>
+                <w:sz w:val="16"/>
+                <w:szCs w:val="16"/>
+              </w:rPr>
+              <w:t xml:space="preserve">  </w:t>
             </w:r>
             <w:r>
               <w:rPr>
@@ -6109,7 +6804,16 @@
                 <w:sz w:val="16"/>
                 <w:szCs w:val="16"/>
               </w:rPr>
-              <w:t>{#</w:t>
+              <w:t>{</w:t>
+            </w:r>
+            <w:proofErr w:type="gramEnd"/>
+            <w:r>
+              <w:rPr>
+                <w:rFonts w:ascii="Arial" w:hAnsi="Arial" w:cs="Arial"/>
+                <w:sz w:val="16"/>
+                <w:szCs w:val="16"/>
+              </w:rPr>
+              <w:t>#</w:t>
             </w:r>
             <w:r>
               <w:rPr>
@@ -6165,7 +6869,25 @@
                 <w:sz w:val="16"/>
                 <w:szCs w:val="16"/>
               </w:rPr>
-              <w:t>{/}{^</w:t>
+              <w:t>{</w:t>
+            </w:r>
+            <w:proofErr w:type="gramStart"/>
+            <w:r>
+              <w:rPr>
+                <w:rFonts w:ascii="Arial" w:hAnsi="Arial" w:cs="Arial"/>
+                <w:sz w:val="16"/>
+                <w:szCs w:val="16"/>
+              </w:rPr>
+              <w:t>/}{</w:t>
+            </w:r>
+            <w:proofErr w:type="gramEnd"/>
+            <w:r>
+              <w:rPr>
+                <w:rFonts w:ascii="Arial" w:hAnsi="Arial" w:cs="Arial"/>
+                <w:sz w:val="16"/>
+                <w:szCs w:val="16"/>
+              </w:rPr>
+              <w:t>^</w:t>
             </w:r>
             <w:r>
               <w:rPr>
@@ -6385,7 +7107,25 @@
                 <w:sz w:val="16"/>
                 <w:szCs w:val="16"/>
               </w:rPr>
-              <w:t>{/}{^</w:t>
+              <w:t>{</w:t>
+            </w:r>
+            <w:proofErr w:type="gramStart"/>
+            <w:r>
+              <w:rPr>
+                <w:rFonts w:ascii="Arial" w:hAnsi="Arial" w:cs="Arial"/>
+                <w:sz w:val="16"/>
+                <w:szCs w:val="16"/>
+              </w:rPr>
+              <w:t>/}{</w:t>
+            </w:r>
+            <w:proofErr w:type="gramEnd"/>
+            <w:r>
+              <w:rPr>
+                <w:rFonts w:ascii="Arial" w:hAnsi="Arial" w:cs="Arial"/>
+                <w:sz w:val="16"/>
+                <w:szCs w:val="16"/>
+              </w:rPr>
+              <w:t>^</w:t>
             </w:r>
             <w:r>
               <w:rPr>
@@ -6444,6 +7184,7 @@
               </w:rPr>
               <w:t xml:space="preserve"> </w:t>
             </w:r>
+            <w:proofErr w:type="gramStart"/>
             <w:r>
               <w:rPr>
                 <w:rFonts w:ascii="Arial" w:eastAsia="Arial" w:hAnsi="Arial" w:cs="Arial"/>
@@ -6459,7 +7200,16 @@
                 <w:sz w:val="16"/>
                 <w:szCs w:val="16"/>
               </w:rPr>
-              <w:t>{#</w:t>
+              <w:t>{</w:t>
+            </w:r>
+            <w:proofErr w:type="gramEnd"/>
+            <w:r>
+              <w:rPr>
+                <w:rFonts w:ascii="Arial" w:hAnsi="Arial" w:cs="Arial"/>
+                <w:sz w:val="16"/>
+                <w:szCs w:val="16"/>
+              </w:rPr>
+              <w:t>#</w:t>
             </w:r>
             <w:r>
               <w:rPr>
@@ -6507,7 +7257,25 @@
                 <w:sz w:val="16"/>
                 <w:szCs w:val="16"/>
               </w:rPr>
-              <w:t>{/}{^</w:t>
+              <w:t>{</w:t>
+            </w:r>
+            <w:proofErr w:type="gramStart"/>
+            <w:r>
+              <w:rPr>
+                <w:rFonts w:ascii="Arial" w:hAnsi="Arial" w:cs="Arial"/>
+                <w:sz w:val="16"/>
+                <w:szCs w:val="16"/>
+              </w:rPr>
+              <w:t>/}{</w:t>
+            </w:r>
+            <w:proofErr w:type="gramEnd"/>
+            <w:r>
+              <w:rPr>
+                <w:rFonts w:ascii="Arial" w:hAnsi="Arial" w:cs="Arial"/>
+                <w:sz w:val="16"/>
+                <w:szCs w:val="16"/>
+              </w:rPr>
+              <w:t>^</w:t>
             </w:r>
             <w:r>
               <w:rPr>
@@ -6572,7 +7340,16 @@
                 <w:sz w:val="16"/>
                 <w:szCs w:val="16"/>
               </w:rPr>
-              <w:t xml:space="preserve">Rarely  </w:t>
+              <w:t>Rarely</w:t>
+            </w:r>
+            <w:proofErr w:type="gramStart"/>
+            <w:r>
+              <w:rPr>
+                <w:rFonts w:ascii="Arial" w:eastAsia="Arial" w:hAnsi="Arial" w:cs="Arial"/>
+                <w:sz w:val="16"/>
+                <w:szCs w:val="16"/>
+              </w:rPr>
+              <w:t xml:space="preserve">  </w:t>
             </w:r>
             <w:r>
               <w:rPr>
@@ -6589,7 +7366,16 @@
                 <w:sz w:val="16"/>
                 <w:szCs w:val="16"/>
               </w:rPr>
-              <w:t>{#</w:t>
+              <w:t>{</w:t>
+            </w:r>
+            <w:proofErr w:type="gramEnd"/>
+            <w:r>
+              <w:rPr>
+                <w:rFonts w:ascii="Arial" w:hAnsi="Arial" w:cs="Arial"/>
+                <w:sz w:val="16"/>
+                <w:szCs w:val="16"/>
+              </w:rPr>
+              <w:t>#</w:t>
             </w:r>
             <w:r>
               <w:rPr>
@@ -6637,7 +7423,25 @@
                 <w:sz w:val="16"/>
                 <w:szCs w:val="16"/>
               </w:rPr>
-              <w:t>{/}{^</w:t>
+              <w:t>{</w:t>
+            </w:r>
+            <w:proofErr w:type="gramStart"/>
+            <w:r>
+              <w:rPr>
+                <w:rFonts w:ascii="Arial" w:hAnsi="Arial" w:cs="Arial"/>
+                <w:sz w:val="16"/>
+                <w:szCs w:val="16"/>
+              </w:rPr>
+              <w:t>/}{</w:t>
+            </w:r>
+            <w:proofErr w:type="gramEnd"/>
+            <w:r>
+              <w:rPr>
+                <w:rFonts w:ascii="Arial" w:hAnsi="Arial" w:cs="Arial"/>
+                <w:sz w:val="16"/>
+                <w:szCs w:val="16"/>
+              </w:rPr>
+              <w:t>^</w:t>
             </w:r>
             <w:r>
               <w:rPr>
@@ -6702,7 +7506,16 @@
                 <w:sz w:val="16"/>
                 <w:szCs w:val="16"/>
               </w:rPr>
-              <w:t xml:space="preserve">Sometimes  </w:t>
+              <w:t>Sometimes</w:t>
+            </w:r>
+            <w:proofErr w:type="gramStart"/>
+            <w:r>
+              <w:rPr>
+                <w:rFonts w:ascii="Arial" w:eastAsia="Arial" w:hAnsi="Arial" w:cs="Arial"/>
+                <w:sz w:val="16"/>
+                <w:szCs w:val="16"/>
+              </w:rPr>
+              <w:t xml:space="preserve">  </w:t>
             </w:r>
             <w:r>
               <w:rPr>
@@ -6719,7 +7532,16 @@
                 <w:sz w:val="16"/>
                 <w:szCs w:val="16"/>
               </w:rPr>
-              <w:t>{#</w:t>
+              <w:t>{</w:t>
+            </w:r>
+            <w:proofErr w:type="gramEnd"/>
+            <w:r>
+              <w:rPr>
+                <w:rFonts w:ascii="Arial" w:hAnsi="Arial" w:cs="Arial"/>
+                <w:sz w:val="16"/>
+                <w:szCs w:val="16"/>
+              </w:rPr>
+              <w:t>#</w:t>
             </w:r>
             <w:r>
               <w:rPr>
@@ -6767,7 +7589,25 @@
                 <w:sz w:val="16"/>
                 <w:szCs w:val="16"/>
               </w:rPr>
-              <w:t>{/}{^</w:t>
+              <w:t>{</w:t>
+            </w:r>
+            <w:proofErr w:type="gramStart"/>
+            <w:r>
+              <w:rPr>
+                <w:rFonts w:ascii="Arial" w:hAnsi="Arial" w:cs="Arial"/>
+                <w:sz w:val="16"/>
+                <w:szCs w:val="16"/>
+              </w:rPr>
+              <w:t>/}{</w:t>
+            </w:r>
+            <w:proofErr w:type="gramEnd"/>
+            <w:r>
+              <w:rPr>
+                <w:rFonts w:ascii="Arial" w:hAnsi="Arial" w:cs="Arial"/>
+                <w:sz w:val="16"/>
+                <w:szCs w:val="16"/>
+              </w:rPr>
+              <w:t>^</w:t>
             </w:r>
             <w:r>
               <w:rPr>
@@ -6911,7 +7751,25 @@
                 <w:sz w:val="16"/>
                 <w:szCs w:val="16"/>
               </w:rPr>
-              <w:t>{/}{^</w:t>
+              <w:t>{</w:t>
+            </w:r>
+            <w:proofErr w:type="gramStart"/>
+            <w:r>
+              <w:rPr>
+                <w:rFonts w:ascii="Arial" w:hAnsi="Arial" w:cs="Arial"/>
+                <w:sz w:val="16"/>
+                <w:szCs w:val="16"/>
+              </w:rPr>
+              <w:t>/}{</w:t>
+            </w:r>
+            <w:proofErr w:type="gramEnd"/>
+            <w:r>
+              <w:rPr>
+                <w:rFonts w:ascii="Arial" w:hAnsi="Arial" w:cs="Arial"/>
+                <w:sz w:val="16"/>
+                <w:szCs w:val="16"/>
+              </w:rPr>
+              <w:t>^</w:t>
             </w:r>
             <w:r>
               <w:rPr>
@@ -6970,6 +7828,7 @@
               </w:rPr>
               <w:t xml:space="preserve"> </w:t>
             </w:r>
+            <w:proofErr w:type="gramStart"/>
             <w:r>
               <w:rPr>
                 <w:rFonts w:ascii="Arial" w:eastAsia="Arial" w:hAnsi="Arial" w:cs="Arial"/>
@@ -6985,7 +7844,16 @@
                 <w:sz w:val="16"/>
                 <w:szCs w:val="16"/>
               </w:rPr>
-              <w:t>{#</w:t>
+              <w:t>{</w:t>
+            </w:r>
+            <w:proofErr w:type="gramEnd"/>
+            <w:r>
+              <w:rPr>
+                <w:rFonts w:ascii="Arial" w:hAnsi="Arial" w:cs="Arial"/>
+                <w:sz w:val="16"/>
+                <w:szCs w:val="16"/>
+              </w:rPr>
+              <w:t>#</w:t>
             </w:r>
             <w:r>
               <w:rPr>
@@ -7033,7 +7901,25 @@
                 <w:sz w:val="16"/>
                 <w:szCs w:val="16"/>
               </w:rPr>
-              <w:t>{/}{^</w:t>
+              <w:t>{</w:t>
+            </w:r>
+            <w:proofErr w:type="gramStart"/>
+            <w:r>
+              <w:rPr>
+                <w:rFonts w:ascii="Arial" w:hAnsi="Arial" w:cs="Arial"/>
+                <w:sz w:val="16"/>
+                <w:szCs w:val="16"/>
+              </w:rPr>
+              <w:t>/}{</w:t>
+            </w:r>
+            <w:proofErr w:type="gramEnd"/>
+            <w:r>
+              <w:rPr>
+                <w:rFonts w:ascii="Arial" w:hAnsi="Arial" w:cs="Arial"/>
+                <w:sz w:val="16"/>
+                <w:szCs w:val="16"/>
+              </w:rPr>
+              <w:t>^</w:t>
             </w:r>
             <w:r>
               <w:rPr>
@@ -7098,7 +7984,16 @@
                 <w:sz w:val="16"/>
                 <w:szCs w:val="16"/>
               </w:rPr>
-              <w:t xml:space="preserve">Rarely  </w:t>
+              <w:t>Rarely</w:t>
+            </w:r>
+            <w:proofErr w:type="gramStart"/>
+            <w:r>
+              <w:rPr>
+                <w:rFonts w:ascii="Arial" w:eastAsia="Arial" w:hAnsi="Arial" w:cs="Arial"/>
+                <w:sz w:val="16"/>
+                <w:szCs w:val="16"/>
+              </w:rPr>
+              <w:t xml:space="preserve">  </w:t>
             </w:r>
             <w:r>
               <w:rPr>
@@ -7115,7 +8010,16 @@
                 <w:sz w:val="16"/>
                 <w:szCs w:val="16"/>
               </w:rPr>
-              <w:t>{#</w:t>
+              <w:t>{</w:t>
+            </w:r>
+            <w:proofErr w:type="gramEnd"/>
+            <w:r>
+              <w:rPr>
+                <w:rFonts w:ascii="Arial" w:hAnsi="Arial" w:cs="Arial"/>
+                <w:sz w:val="16"/>
+                <w:szCs w:val="16"/>
+              </w:rPr>
+              <w:t>#</w:t>
             </w:r>
             <w:r>
               <w:rPr>
@@ -7163,7 +8067,25 @@
                 <w:sz w:val="16"/>
                 <w:szCs w:val="16"/>
               </w:rPr>
-              <w:t>{/}{^</w:t>
+              <w:t>{</w:t>
+            </w:r>
+            <w:proofErr w:type="gramStart"/>
+            <w:r>
+              <w:rPr>
+                <w:rFonts w:ascii="Arial" w:hAnsi="Arial" w:cs="Arial"/>
+                <w:sz w:val="16"/>
+                <w:szCs w:val="16"/>
+              </w:rPr>
+              <w:t>/}{</w:t>
+            </w:r>
+            <w:proofErr w:type="gramEnd"/>
+            <w:r>
+              <w:rPr>
+                <w:rFonts w:ascii="Arial" w:hAnsi="Arial" w:cs="Arial"/>
+                <w:sz w:val="16"/>
+                <w:szCs w:val="16"/>
+              </w:rPr>
+              <w:t>^</w:t>
             </w:r>
             <w:r>
               <w:rPr>
@@ -7228,7 +8150,16 @@
                 <w:sz w:val="16"/>
                 <w:szCs w:val="16"/>
               </w:rPr>
-              <w:t xml:space="preserve">Sometimes  </w:t>
+              <w:t>Sometimes</w:t>
+            </w:r>
+            <w:proofErr w:type="gramStart"/>
+            <w:r>
+              <w:rPr>
+                <w:rFonts w:ascii="Arial" w:eastAsia="Arial" w:hAnsi="Arial" w:cs="Arial"/>
+                <w:sz w:val="16"/>
+                <w:szCs w:val="16"/>
+              </w:rPr>
+              <w:t xml:space="preserve">  </w:t>
             </w:r>
             <w:r>
               <w:rPr>
@@ -7245,7 +8176,16 @@
                 <w:sz w:val="16"/>
                 <w:szCs w:val="16"/>
               </w:rPr>
-              <w:t>{#</w:t>
+              <w:t>{</w:t>
+            </w:r>
+            <w:proofErr w:type="gramEnd"/>
+            <w:r>
+              <w:rPr>
+                <w:rFonts w:ascii="Arial" w:hAnsi="Arial" w:cs="Arial"/>
+                <w:sz w:val="16"/>
+                <w:szCs w:val="16"/>
+              </w:rPr>
+              <w:t>#</w:t>
             </w:r>
             <w:r>
               <w:rPr>
@@ -7293,7 +8233,25 @@
                 <w:sz w:val="16"/>
                 <w:szCs w:val="16"/>
               </w:rPr>
-              <w:t>{/}{^</w:t>
+              <w:t>{</w:t>
+            </w:r>
+            <w:proofErr w:type="gramStart"/>
+            <w:r>
+              <w:rPr>
+                <w:rFonts w:ascii="Arial" w:hAnsi="Arial" w:cs="Arial"/>
+                <w:sz w:val="16"/>
+                <w:szCs w:val="16"/>
+              </w:rPr>
+              <w:t>/}{</w:t>
+            </w:r>
+            <w:proofErr w:type="gramEnd"/>
+            <w:r>
+              <w:rPr>
+                <w:rFonts w:ascii="Arial" w:hAnsi="Arial" w:cs="Arial"/>
+                <w:sz w:val="16"/>
+                <w:szCs w:val="16"/>
+              </w:rPr>
+              <w:t>^</w:t>
             </w:r>
             <w:r>
               <w:rPr>
@@ -7505,7 +8463,25 @@
                 <w:sz w:val="16"/>
                 <w:szCs w:val="16"/>
               </w:rPr>
-              <w:t>{/}{^</w:t>
+              <w:t>{</w:t>
+            </w:r>
+            <w:proofErr w:type="gramStart"/>
+            <w:r>
+              <w:rPr>
+                <w:rFonts w:ascii="Arial" w:hAnsi="Arial" w:cs="Arial"/>
+                <w:sz w:val="16"/>
+                <w:szCs w:val="16"/>
+              </w:rPr>
+              <w:t>/}{</w:t>
+            </w:r>
+            <w:proofErr w:type="gramEnd"/>
+            <w:r>
+              <w:rPr>
+                <w:rFonts w:ascii="Arial" w:hAnsi="Arial" w:cs="Arial"/>
+                <w:sz w:val="16"/>
+                <w:szCs w:val="16"/>
+              </w:rPr>
+              <w:t>^</w:t>
             </w:r>
             <w:r>
               <w:rPr>
@@ -7564,6 +8540,7 @@
               </w:rPr>
               <w:t xml:space="preserve"> </w:t>
             </w:r>
+            <w:proofErr w:type="gramStart"/>
             <w:r>
               <w:rPr>
                 <w:rFonts w:ascii="Arial" w:eastAsia="Arial" w:hAnsi="Arial" w:cs="Arial"/>
@@ -7579,7 +8556,16 @@
                 <w:sz w:val="16"/>
                 <w:szCs w:val="16"/>
               </w:rPr>
-              <w:t>{#</w:t>
+              <w:t>{</w:t>
+            </w:r>
+            <w:proofErr w:type="gramEnd"/>
+            <w:r>
+              <w:rPr>
+                <w:rFonts w:ascii="Arial" w:hAnsi="Arial" w:cs="Arial"/>
+                <w:sz w:val="16"/>
+                <w:szCs w:val="16"/>
+              </w:rPr>
+              <w:t>#</w:t>
             </w:r>
             <w:r>
               <w:rPr>
@@ -7627,7 +8613,25 @@
                 <w:sz w:val="16"/>
                 <w:szCs w:val="16"/>
               </w:rPr>
-              <w:t>{/}{^</w:t>
+              <w:t>{</w:t>
+            </w:r>
+            <w:proofErr w:type="gramStart"/>
+            <w:r>
+              <w:rPr>
+                <w:rFonts w:ascii="Arial" w:hAnsi="Arial" w:cs="Arial"/>
+                <w:sz w:val="16"/>
+                <w:szCs w:val="16"/>
+              </w:rPr>
+              <w:t>/}{</w:t>
+            </w:r>
+            <w:proofErr w:type="gramEnd"/>
+            <w:r>
+              <w:rPr>
+                <w:rFonts w:ascii="Arial" w:hAnsi="Arial" w:cs="Arial"/>
+                <w:sz w:val="16"/>
+                <w:szCs w:val="16"/>
+              </w:rPr>
+              <w:t>^</w:t>
             </w:r>
             <w:r>
               <w:rPr>
@@ -7692,7 +8696,16 @@
                 <w:sz w:val="16"/>
                 <w:szCs w:val="16"/>
               </w:rPr>
-              <w:t xml:space="preserve">Adequate  </w:t>
+              <w:t>Adequate</w:t>
+            </w:r>
+            <w:proofErr w:type="gramStart"/>
+            <w:r>
+              <w:rPr>
+                <w:rFonts w:ascii="Arial" w:eastAsia="Arial" w:hAnsi="Arial" w:cs="Arial"/>
+                <w:sz w:val="16"/>
+                <w:szCs w:val="16"/>
+              </w:rPr>
+              <w:t xml:space="preserve">  </w:t>
             </w:r>
             <w:r>
               <w:rPr>
@@ -7709,7 +8722,16 @@
                 <w:sz w:val="16"/>
                 <w:szCs w:val="16"/>
               </w:rPr>
-              <w:t>{#</w:t>
+              <w:t>{</w:t>
+            </w:r>
+            <w:proofErr w:type="gramEnd"/>
+            <w:r>
+              <w:rPr>
+                <w:rFonts w:ascii="Arial" w:hAnsi="Arial" w:cs="Arial"/>
+                <w:sz w:val="16"/>
+                <w:szCs w:val="16"/>
+              </w:rPr>
+              <w:t>#</w:t>
             </w:r>
             <w:r>
               <w:rPr>
@@ -7757,7 +8779,25 @@
                 <w:sz w:val="16"/>
                 <w:szCs w:val="16"/>
               </w:rPr>
-              <w:t>{/}{^</w:t>
+              <w:t>{</w:t>
+            </w:r>
+            <w:proofErr w:type="gramStart"/>
+            <w:r>
+              <w:rPr>
+                <w:rFonts w:ascii="Arial" w:hAnsi="Arial" w:cs="Arial"/>
+                <w:sz w:val="16"/>
+                <w:szCs w:val="16"/>
+              </w:rPr>
+              <w:t>/}{</w:t>
+            </w:r>
+            <w:proofErr w:type="gramEnd"/>
+            <w:r>
+              <w:rPr>
+                <w:rFonts w:ascii="Arial" w:hAnsi="Arial" w:cs="Arial"/>
+                <w:sz w:val="16"/>
+                <w:szCs w:val="16"/>
+              </w:rPr>
+              <w:t>^</w:t>
             </w:r>
             <w:r>
               <w:rPr>
@@ -7805,7 +8845,16 @@
                 <w:sz w:val="16"/>
                 <w:szCs w:val="16"/>
               </w:rPr>
-              <w:t>{/}</w:t>
+              <w:t>{</w:t>
+            </w:r>
+            <w:proofErr w:type="gramStart"/>
+            <w:r>
+              <w:rPr>
+                <w:rFonts w:ascii="Arial" w:hAnsi="Arial" w:cs="Arial"/>
+                <w:sz w:val="16"/>
+                <w:szCs w:val="16"/>
+              </w:rPr>
+              <w:t>/}</w:t>
             </w:r>
             <w:permEnd w:id="125199550"/>
             <w:r>
@@ -7824,6 +8873,7 @@
               </w:rPr>
               <w:t xml:space="preserve"> Poor</w:t>
             </w:r>
+            <w:proofErr w:type="gramEnd"/>
           </w:p>
         </w:tc>
         <w:tc>
@@ -7901,7 +8951,25 @@
                 <w:sz w:val="16"/>
                 <w:szCs w:val="16"/>
               </w:rPr>
-              <w:t>{/}{^</w:t>
+              <w:t>{</w:t>
+            </w:r>
+            <w:proofErr w:type="gramStart"/>
+            <w:r>
+              <w:rPr>
+                <w:rFonts w:ascii="Arial" w:hAnsi="Arial" w:cs="Arial"/>
+                <w:sz w:val="16"/>
+                <w:szCs w:val="16"/>
+              </w:rPr>
+              <w:t>/}{</w:t>
+            </w:r>
+            <w:proofErr w:type="gramEnd"/>
+            <w:r>
+              <w:rPr>
+                <w:rFonts w:ascii="Arial" w:hAnsi="Arial" w:cs="Arial"/>
+                <w:sz w:val="16"/>
+                <w:szCs w:val="16"/>
+              </w:rPr>
+              <w:t>^</w:t>
             </w:r>
             <w:r>
               <w:rPr>
@@ -7960,6 +9028,7 @@
               </w:rPr>
               <w:t xml:space="preserve"> </w:t>
             </w:r>
+            <w:proofErr w:type="gramStart"/>
             <w:r>
               <w:rPr>
                 <w:rFonts w:ascii="Arial" w:eastAsia="Arial" w:hAnsi="Arial" w:cs="Arial"/>
@@ -7975,7 +9044,16 @@
                 <w:sz w:val="16"/>
                 <w:szCs w:val="16"/>
               </w:rPr>
-              <w:t>{#</w:t>
+              <w:t>{</w:t>
+            </w:r>
+            <w:proofErr w:type="gramEnd"/>
+            <w:r>
+              <w:rPr>
+                <w:rFonts w:ascii="Arial" w:hAnsi="Arial" w:cs="Arial"/>
+                <w:sz w:val="16"/>
+                <w:szCs w:val="16"/>
+              </w:rPr>
+              <w:t>#</w:t>
             </w:r>
             <w:r>
               <w:rPr>
@@ -8023,7 +9101,25 @@
                 <w:sz w:val="16"/>
                 <w:szCs w:val="16"/>
               </w:rPr>
-              <w:t>{/}{^</w:t>
+              <w:t>{</w:t>
+            </w:r>
+            <w:proofErr w:type="gramStart"/>
+            <w:r>
+              <w:rPr>
+                <w:rFonts w:ascii="Arial" w:hAnsi="Arial" w:cs="Arial"/>
+                <w:sz w:val="16"/>
+                <w:szCs w:val="16"/>
+              </w:rPr>
+              <w:t>/}{</w:t>
+            </w:r>
+            <w:proofErr w:type="gramEnd"/>
+            <w:r>
+              <w:rPr>
+                <w:rFonts w:ascii="Arial" w:hAnsi="Arial" w:cs="Arial"/>
+                <w:sz w:val="16"/>
+                <w:szCs w:val="16"/>
+              </w:rPr>
+              <w:t>^</w:t>
             </w:r>
             <w:r>
               <w:rPr>
@@ -8071,7 +9167,16 @@
                 <w:sz w:val="16"/>
                 <w:szCs w:val="16"/>
               </w:rPr>
-              <w:t>{/}</w:t>
+              <w:t>{</w:t>
+            </w:r>
+            <w:proofErr w:type="gramStart"/>
+            <w:r>
+              <w:rPr>
+                <w:rFonts w:ascii="Arial" w:hAnsi="Arial" w:cs="Arial"/>
+                <w:sz w:val="16"/>
+                <w:szCs w:val="16"/>
+              </w:rPr>
+              <w:t>/}</w:t>
             </w:r>
             <w:permEnd w:id="1850166683"/>
             <w:r>
@@ -8088,7 +9193,16 @@
                 <w:sz w:val="16"/>
                 <w:szCs w:val="16"/>
               </w:rPr>
-              <w:t xml:space="preserve">Adequate  </w:t>
+              <w:t>Adequate</w:t>
+            </w:r>
+            <w:proofErr w:type="gramEnd"/>
+            <w:r>
+              <w:rPr>
+                <w:rFonts w:ascii="Arial" w:eastAsia="Arial" w:hAnsi="Arial" w:cs="Arial"/>
+                <w:sz w:val="16"/>
+                <w:szCs w:val="16"/>
+              </w:rPr>
+              <w:t xml:space="preserve">  </w:t>
             </w:r>
             <w:permStart w:id="674262347" w:edGrp="everyone"/>
             <w:r>
@@ -8145,7 +9259,25 @@
                 <w:sz w:val="16"/>
                 <w:szCs w:val="16"/>
               </w:rPr>
-              <w:t>{/}{^</w:t>
+              <w:t>{</w:t>
+            </w:r>
+            <w:proofErr w:type="gramStart"/>
+            <w:r>
+              <w:rPr>
+                <w:rFonts w:ascii="Arial" w:hAnsi="Arial" w:cs="Arial"/>
+                <w:sz w:val="16"/>
+                <w:szCs w:val="16"/>
+              </w:rPr>
+              <w:t>/}{</w:t>
+            </w:r>
+            <w:proofErr w:type="gramEnd"/>
+            <w:r>
+              <w:rPr>
+                <w:rFonts w:ascii="Arial" w:hAnsi="Arial" w:cs="Arial"/>
+                <w:sz w:val="16"/>
+                <w:szCs w:val="16"/>
+              </w:rPr>
+              <w:t>^</w:t>
             </w:r>
             <w:r>
               <w:rPr>
@@ -8193,7 +9325,16 @@
                 <w:sz w:val="16"/>
                 <w:szCs w:val="16"/>
               </w:rPr>
-              <w:t>{/}</w:t>
+              <w:t>{</w:t>
+            </w:r>
+            <w:proofErr w:type="gramStart"/>
+            <w:r>
+              <w:rPr>
+                <w:rFonts w:ascii="Arial" w:hAnsi="Arial" w:cs="Arial"/>
+                <w:sz w:val="16"/>
+                <w:szCs w:val="16"/>
+              </w:rPr>
+              <w:t>/}</w:t>
             </w:r>
             <w:permEnd w:id="674262347"/>
             <w:r>
@@ -8212,6 +9353,7 @@
               </w:rPr>
               <w:t>Poor</w:t>
             </w:r>
+            <w:proofErr w:type="gramEnd"/>
           </w:p>
         </w:tc>
       </w:tr>
@@ -8616,7 +9758,16 @@
                 <w:sz w:val="16"/>
                 <w:szCs w:val="16"/>
               </w:rPr>
-              <w:t xml:space="preserve"> Interview:  </w:t>
+              <w:t xml:space="preserve"> Interview</w:t>
+            </w:r>
+            <w:proofErr w:type="gramStart"/>
+            <w:r>
+              <w:rPr>
+                <w:rFonts w:ascii="Arial" w:eastAsia="Arial" w:hAnsi="Arial" w:cs="Arial"/>
+                <w:sz w:val="16"/>
+                <w:szCs w:val="16"/>
+              </w:rPr>
+              <w:t xml:space="preserve">:  </w:t>
             </w:r>
             <w:bookmarkStart w:id="15" w:name="bookmark=id.3j2qqm3" w:colFirst="0" w:colLast="0"/>
             <w:bookmarkEnd w:id="15"/>
@@ -8627,7 +9778,16 @@
                 <w:sz w:val="16"/>
                 <w:szCs w:val="16"/>
               </w:rPr>
-              <w:t>{#</w:t>
+              <w:t>{</w:t>
+            </w:r>
+            <w:proofErr w:type="gramEnd"/>
+            <w:r>
+              <w:rPr>
+                <w:rFonts w:ascii="Arial" w:hAnsi="Arial" w:cs="Arial"/>
+                <w:sz w:val="16"/>
+                <w:szCs w:val="16"/>
+              </w:rPr>
+              <w:t>#</w:t>
             </w:r>
             <w:r>
               <w:rPr>
@@ -8675,7 +9835,25 @@
                 <w:sz w:val="16"/>
                 <w:szCs w:val="16"/>
               </w:rPr>
-              <w:t>{/}{^</w:t>
+              <w:t>{</w:t>
+            </w:r>
+            <w:proofErr w:type="gramStart"/>
+            <w:r>
+              <w:rPr>
+                <w:rFonts w:ascii="Arial" w:hAnsi="Arial" w:cs="Arial"/>
+                <w:sz w:val="16"/>
+                <w:szCs w:val="16"/>
+              </w:rPr>
+              <w:t>/}{</w:t>
+            </w:r>
+            <w:proofErr w:type="gramEnd"/>
+            <w:r>
+              <w:rPr>
+                <w:rFonts w:ascii="Arial" w:hAnsi="Arial" w:cs="Arial"/>
+                <w:sz w:val="16"/>
+                <w:szCs w:val="16"/>
+              </w:rPr>
+              <w:t>^</w:t>
             </w:r>
             <w:r>
               <w:rPr>
@@ -8723,7 +9901,16 @@
                 <w:sz w:val="16"/>
                 <w:szCs w:val="16"/>
               </w:rPr>
-              <w:t>{/}</w:t>
+              <w:t>{</w:t>
+            </w:r>
+            <w:proofErr w:type="gramStart"/>
+            <w:r>
+              <w:rPr>
+                <w:rFonts w:ascii="Arial" w:hAnsi="Arial" w:cs="Arial"/>
+                <w:sz w:val="16"/>
+                <w:szCs w:val="16"/>
+              </w:rPr>
+              <w:t>/}</w:t>
             </w:r>
             <w:permEnd w:id="1598717048"/>
             <w:r>
@@ -8739,7 +9926,16 @@
                 <w:sz w:val="16"/>
                 <w:szCs w:val="16"/>
               </w:rPr>
-              <w:t xml:space="preserve"> Yes  </w:t>
+              <w:t xml:space="preserve"> Yes</w:t>
+            </w:r>
+            <w:proofErr w:type="gramEnd"/>
+            <w:r>
+              <w:rPr>
+                <w:rFonts w:ascii="Arial" w:eastAsia="Arial" w:hAnsi="Arial" w:cs="Arial"/>
+                <w:sz w:val="16"/>
+                <w:szCs w:val="16"/>
+              </w:rPr>
+              <w:t xml:space="preserve">  </w:t>
             </w:r>
             <w:permStart w:id="1120095361" w:edGrp="everyone"/>
             <w:r>
@@ -8814,8 +10010,18 @@
                 <w:sz w:val="16"/>
                 <w:szCs w:val="16"/>
               </w:rPr>
-              <w:t>{/}{</w:t>
-            </w:r>
+              <w:t>{</w:t>
+            </w:r>
+            <w:proofErr w:type="gramStart"/>
+            <w:r>
+              <w:rPr>
+                <w:rFonts w:ascii="Arial" w:hAnsi="Arial" w:cs="Arial"/>
+                <w:sz w:val="16"/>
+                <w:szCs w:val="16"/>
+              </w:rPr>
+              <w:t>/}{</w:t>
+            </w:r>
+            <w:proofErr w:type="gramEnd"/>
             <w:r>
               <w:rPr>
                 <w:rFonts w:ascii="Arial" w:hAnsi="Arial" w:cs="Arial"/>
@@ -8878,7 +10084,16 @@
                 <w:sz w:val="16"/>
                 <w:szCs w:val="16"/>
               </w:rPr>
-              <w:t>{/}</w:t>
+              <w:t>{</w:t>
+            </w:r>
+            <w:proofErr w:type="gramStart"/>
+            <w:r>
+              <w:rPr>
+                <w:rFonts w:ascii="Arial" w:hAnsi="Arial" w:cs="Arial"/>
+                <w:sz w:val="16"/>
+                <w:szCs w:val="16"/>
+              </w:rPr>
+              <w:t>/}</w:t>
             </w:r>
             <w:permEnd w:id="1120095361"/>
             <w:r>
@@ -8894,7 +10109,16 @@
                 <w:sz w:val="16"/>
                 <w:szCs w:val="16"/>
               </w:rPr>
-              <w:t xml:space="preserve"> No - Why Not: </w:t>
+              <w:t xml:space="preserve"> No</w:t>
+            </w:r>
+            <w:proofErr w:type="gramEnd"/>
+            <w:r>
+              <w:rPr>
+                <w:rFonts w:ascii="Arial" w:eastAsia="Arial" w:hAnsi="Arial" w:cs="Arial"/>
+                <w:sz w:val="16"/>
+                <w:szCs w:val="16"/>
+              </w:rPr>
+              <w:t xml:space="preserve"> - Why Not: </w:t>
             </w:r>
             <w:r>
               <w:rPr>
@@ -9013,7 +10237,25 @@
                 <w:sz w:val="16"/>
                 <w:szCs w:val="16"/>
               </w:rPr>
-              <w:t>{/}{^</w:t>
+              <w:t>{</w:t>
+            </w:r>
+            <w:proofErr w:type="gramStart"/>
+            <w:r>
+              <w:rPr>
+                <w:rFonts w:ascii="Arial" w:hAnsi="Arial" w:cs="Arial"/>
+                <w:sz w:val="16"/>
+                <w:szCs w:val="16"/>
+              </w:rPr>
+              <w:t>/}{</w:t>
+            </w:r>
+            <w:proofErr w:type="gramEnd"/>
+            <w:r>
+              <w:rPr>
+                <w:rFonts w:ascii="Arial" w:hAnsi="Arial" w:cs="Arial"/>
+                <w:sz w:val="16"/>
+                <w:szCs w:val="16"/>
+              </w:rPr>
+              <w:t>^</w:t>
             </w:r>
             <w:proofErr w:type="spellStart"/>
             <w:r>
@@ -9063,7 +10305,16 @@
                 <w:sz w:val="16"/>
                 <w:szCs w:val="16"/>
               </w:rPr>
-              <w:t>{/}</w:t>
+              <w:t>{</w:t>
+            </w:r>
+            <w:proofErr w:type="gramStart"/>
+            <w:r>
+              <w:rPr>
+                <w:rFonts w:ascii="Arial" w:hAnsi="Arial" w:cs="Arial"/>
+                <w:sz w:val="16"/>
+                <w:szCs w:val="16"/>
+              </w:rPr>
+              <w:t>/}</w:t>
             </w:r>
             <w:permEnd w:id="1922069747"/>
             <w:r>
@@ -9087,7 +10338,16 @@
                 <w:sz w:val="16"/>
                 <w:szCs w:val="16"/>
               </w:rPr>
-              <w:t xml:space="preserve">Yes  </w:t>
+              <w:t>Yes</w:t>
+            </w:r>
+            <w:proofErr w:type="gramEnd"/>
+            <w:r>
+              <w:rPr>
+                <w:rFonts w:ascii="Arial" w:eastAsia="Arial" w:hAnsi="Arial" w:cs="Arial"/>
+                <w:sz w:val="16"/>
+                <w:szCs w:val="16"/>
+              </w:rPr>
+              <w:t xml:space="preserve">  </w:t>
             </w:r>
             <w:permStart w:id="1761028961" w:edGrp="everyone"/>
             <w:r>
@@ -9162,8 +10422,18 @@
                 <w:sz w:val="16"/>
                 <w:szCs w:val="16"/>
               </w:rPr>
-              <w:t>{/}{</w:t>
-            </w:r>
+              <w:t>{</w:t>
+            </w:r>
+            <w:proofErr w:type="gramStart"/>
+            <w:r>
+              <w:rPr>
+                <w:rFonts w:ascii="Arial" w:hAnsi="Arial" w:cs="Arial"/>
+                <w:sz w:val="16"/>
+                <w:szCs w:val="16"/>
+              </w:rPr>
+              <w:t>/}{</w:t>
+            </w:r>
+            <w:proofErr w:type="gramEnd"/>
             <w:r>
               <w:rPr>
                 <w:rFonts w:ascii="Arial" w:hAnsi="Arial" w:cs="Arial"/>
@@ -9210,7 +10480,16 @@
                 <w:sz w:val="16"/>
                 <w:szCs w:val="16"/>
               </w:rPr>
-              <w:t>{/}</w:t>
+              <w:t>{</w:t>
+            </w:r>
+            <w:proofErr w:type="gramStart"/>
+            <w:r>
+              <w:rPr>
+                <w:rFonts w:ascii="Arial" w:hAnsi="Arial" w:cs="Arial"/>
+                <w:sz w:val="16"/>
+                <w:szCs w:val="16"/>
+              </w:rPr>
+              <w:t>/}</w:t>
             </w:r>
             <w:permEnd w:id="1761028961"/>
             <w:r>
@@ -9229,6 +10508,7 @@
               </w:rPr>
               <w:t xml:space="preserve"> No</w:t>
             </w:r>
+            <w:proofErr w:type="gramEnd"/>
           </w:p>
         </w:tc>
       </w:tr>
@@ -9290,7 +10570,25 @@
                 <w:sz w:val="18"/>
                 <w:szCs w:val="18"/>
               </w:rPr>
-              <w:t>{comment}     </w:t>
+              <w:t>{</w:t>
+            </w:r>
+            <w:proofErr w:type="gramStart"/>
+            <w:r>
+              <w:rPr>
+                <w:rFonts w:ascii="Courier New" w:eastAsia="Courier New" w:hAnsi="Courier New" w:cs="Courier New"/>
+                <w:sz w:val="18"/>
+                <w:szCs w:val="18"/>
+              </w:rPr>
+              <w:t>comment}   </w:t>
+            </w:r>
+            <w:proofErr w:type="gramEnd"/>
+            <w:r>
+              <w:rPr>
+                <w:rFonts w:ascii="Courier New" w:eastAsia="Courier New" w:hAnsi="Courier New" w:cs="Courier New"/>
+                <w:sz w:val="18"/>
+                <w:szCs w:val="18"/>
+              </w:rPr>
+              <w:t>  </w:t>
             </w:r>
           </w:p>
         </w:tc>
@@ -9406,7 +10704,25 @@
                 <w:sz w:val="16"/>
                 <w:szCs w:val="16"/>
               </w:rPr>
-              <w:t>{/}{^</w:t>
+              <w:t>{</w:t>
+            </w:r>
+            <w:proofErr w:type="gramStart"/>
+            <w:r>
+              <w:rPr>
+                <w:rFonts w:ascii="Arial" w:hAnsi="Arial" w:cs="Arial"/>
+                <w:sz w:val="16"/>
+                <w:szCs w:val="16"/>
+              </w:rPr>
+              <w:t>/}{</w:t>
+            </w:r>
+            <w:proofErr w:type="gramEnd"/>
+            <w:r>
+              <w:rPr>
+                <w:rFonts w:ascii="Arial" w:hAnsi="Arial" w:cs="Arial"/>
+                <w:sz w:val="16"/>
+                <w:szCs w:val="16"/>
+              </w:rPr>
+              <w:t>^</w:t>
             </w:r>
             <w:proofErr w:type="spellStart"/>
             <w:r>
@@ -9456,7 +10772,16 @@
                 <w:sz w:val="16"/>
                 <w:szCs w:val="16"/>
               </w:rPr>
-              <w:t>{/}</w:t>
+              <w:t>{</w:t>
+            </w:r>
+            <w:proofErr w:type="gramStart"/>
+            <w:r>
+              <w:rPr>
+                <w:rFonts w:ascii="Arial" w:hAnsi="Arial" w:cs="Arial"/>
+                <w:sz w:val="16"/>
+                <w:szCs w:val="16"/>
+              </w:rPr>
+              <w:t>/}</w:t>
             </w:r>
             <w:permEnd w:id="526257129"/>
             <w:r>
@@ -9480,7 +10805,16 @@
                 <w:sz w:val="16"/>
                 <w:szCs w:val="16"/>
               </w:rPr>
-              <w:t>Remain Misconduct Free</w:t>
+              <w:t>Remain</w:t>
+            </w:r>
+            <w:proofErr w:type="gramEnd"/>
+            <w:r>
+              <w:rPr>
+                <w:rFonts w:ascii="Arial" w:eastAsia="Arial" w:hAnsi="Arial" w:cs="Arial"/>
+                <w:sz w:val="16"/>
+                <w:szCs w:val="16"/>
+              </w:rPr>
+              <w:t xml:space="preserve"> Misconduct Free</w:t>
             </w:r>
           </w:p>
         </w:tc>
@@ -9561,7 +10895,25 @@
                 <w:sz w:val="16"/>
                 <w:szCs w:val="16"/>
               </w:rPr>
-              <w:t>{/}{^</w:t>
+              <w:t>{</w:t>
+            </w:r>
+            <w:proofErr w:type="gramStart"/>
+            <w:r>
+              <w:rPr>
+                <w:rFonts w:ascii="Arial" w:hAnsi="Arial" w:cs="Arial"/>
+                <w:sz w:val="16"/>
+                <w:szCs w:val="16"/>
+              </w:rPr>
+              <w:t>/}{</w:t>
+            </w:r>
+            <w:proofErr w:type="gramEnd"/>
+            <w:r>
+              <w:rPr>
+                <w:rFonts w:ascii="Arial" w:hAnsi="Arial" w:cs="Arial"/>
+                <w:sz w:val="16"/>
+                <w:szCs w:val="16"/>
+              </w:rPr>
+              <w:t>^</w:t>
             </w:r>
             <w:r>
               <w:rPr>
@@ -9609,7 +10961,16 @@
                 <w:sz w:val="16"/>
                 <w:szCs w:val="16"/>
               </w:rPr>
-              <w:t>{/}</w:t>
+              <w:t>{</w:t>
+            </w:r>
+            <w:proofErr w:type="gramStart"/>
+            <w:r>
+              <w:rPr>
+                <w:rFonts w:ascii="Arial" w:hAnsi="Arial" w:cs="Arial"/>
+                <w:sz w:val="16"/>
+                <w:szCs w:val="16"/>
+              </w:rPr>
+              <w:t>/}</w:t>
             </w:r>
             <w:permEnd w:id="621548145"/>
             <w:r>
@@ -9633,7 +10994,16 @@
                 <w:sz w:val="16"/>
                 <w:szCs w:val="16"/>
               </w:rPr>
-              <w:t>Participate/Advance in IISP</w:t>
+              <w:t>Participate</w:t>
+            </w:r>
+            <w:proofErr w:type="gramEnd"/>
+            <w:r>
+              <w:rPr>
+                <w:rFonts w:ascii="Arial" w:eastAsia="Arial" w:hAnsi="Arial" w:cs="Arial"/>
+                <w:sz w:val="16"/>
+                <w:szCs w:val="16"/>
+              </w:rPr>
+              <w:t>/Advance in IISP</w:t>
             </w:r>
           </w:p>
         </w:tc>
@@ -9712,7 +11082,25 @@
                 <w:sz w:val="16"/>
                 <w:szCs w:val="16"/>
               </w:rPr>
-              <w:t>{/}{^</w:t>
+              <w:t>{</w:t>
+            </w:r>
+            <w:proofErr w:type="gramStart"/>
+            <w:r>
+              <w:rPr>
+                <w:rFonts w:ascii="Arial" w:hAnsi="Arial" w:cs="Arial"/>
+                <w:sz w:val="16"/>
+                <w:szCs w:val="16"/>
+              </w:rPr>
+              <w:t>/}{</w:t>
+            </w:r>
+            <w:proofErr w:type="gramEnd"/>
+            <w:r>
+              <w:rPr>
+                <w:rFonts w:ascii="Arial" w:hAnsi="Arial" w:cs="Arial"/>
+                <w:sz w:val="16"/>
+                <w:szCs w:val="16"/>
+              </w:rPr>
+              <w:t>^</w:t>
             </w:r>
             <w:r>
               <w:rPr>
@@ -9760,7 +11148,16 @@
                 <w:sz w:val="16"/>
                 <w:szCs w:val="16"/>
               </w:rPr>
-              <w:t>{/}</w:t>
+              <w:t>{</w:t>
+            </w:r>
+            <w:proofErr w:type="gramStart"/>
+            <w:r>
+              <w:rPr>
+                <w:rFonts w:ascii="Arial" w:hAnsi="Arial" w:cs="Arial"/>
+                <w:sz w:val="16"/>
+                <w:szCs w:val="16"/>
+              </w:rPr>
+              <w:t>/}</w:t>
             </w:r>
             <w:permEnd w:id="1932093242"/>
             <w:r>
@@ -9784,7 +11181,16 @@
                 <w:sz w:val="16"/>
                 <w:szCs w:val="16"/>
               </w:rPr>
-              <w:t xml:space="preserve">Other: </w:t>
+              <w:t>Other</w:t>
+            </w:r>
+            <w:proofErr w:type="gramEnd"/>
+            <w:r>
+              <w:rPr>
+                <w:rFonts w:ascii="Arial" w:eastAsia="Arial" w:hAnsi="Arial" w:cs="Arial"/>
+                <w:sz w:val="16"/>
+                <w:szCs w:val="16"/>
+              </w:rPr>
+              <w:t xml:space="preserve">: </w:t>
             </w:r>
             <w:r>
               <w:rPr>
@@ -10009,7 +11415,25 @@
                 <w:sz w:val="16"/>
                 <w:szCs w:val="16"/>
               </w:rPr>
-              <w:t>{/}{^</w:t>
+              <w:t>{</w:t>
+            </w:r>
+            <w:proofErr w:type="gramStart"/>
+            <w:r>
+              <w:rPr>
+                <w:rFonts w:ascii="Arial" w:hAnsi="Arial" w:cs="Arial"/>
+                <w:sz w:val="16"/>
+                <w:szCs w:val="16"/>
+              </w:rPr>
+              <w:t>/}{</w:t>
+            </w:r>
+            <w:proofErr w:type="gramEnd"/>
+            <w:r>
+              <w:rPr>
+                <w:rFonts w:ascii="Arial" w:hAnsi="Arial" w:cs="Arial"/>
+                <w:sz w:val="16"/>
+                <w:szCs w:val="16"/>
+              </w:rPr>
+              <w:t>^</w:t>
             </w:r>
             <w:r>
               <w:rPr>
@@ -10057,7 +11481,16 @@
                 <w:sz w:val="16"/>
                 <w:szCs w:val="16"/>
               </w:rPr>
-              <w:t>{/}</w:t>
+              <w:t>{</w:t>
+            </w:r>
+            <w:proofErr w:type="gramStart"/>
+            <w:r>
+              <w:rPr>
+                <w:rFonts w:ascii="Arial" w:hAnsi="Arial" w:cs="Arial"/>
+                <w:sz w:val="16"/>
+                <w:szCs w:val="16"/>
+              </w:rPr>
+              <w:t>/}</w:t>
             </w:r>
             <w:permEnd w:id="1152915268"/>
             <w:r>
@@ -10081,7 +11514,16 @@
                 <w:sz w:val="16"/>
                 <w:szCs w:val="16"/>
               </w:rPr>
-              <w:t xml:space="preserve">Continue Segregation  </w:t>
+              <w:t>Continue</w:t>
+            </w:r>
+            <w:proofErr w:type="gramEnd"/>
+            <w:r>
+              <w:rPr>
+                <w:rFonts w:ascii="Arial" w:eastAsia="Arial" w:hAnsi="Arial" w:cs="Arial"/>
+                <w:sz w:val="16"/>
+                <w:szCs w:val="16"/>
+              </w:rPr>
+              <w:t xml:space="preserve"> Segregation  </w:t>
             </w:r>
           </w:p>
         </w:tc>
@@ -10158,7 +11600,25 @@
                 <w:sz w:val="16"/>
                 <w:szCs w:val="16"/>
               </w:rPr>
-              <w:t>{/}{^</w:t>
+              <w:t>{</w:t>
+            </w:r>
+            <w:proofErr w:type="gramStart"/>
+            <w:r>
+              <w:rPr>
+                <w:rFonts w:ascii="Arial" w:hAnsi="Arial" w:cs="Arial"/>
+                <w:sz w:val="16"/>
+                <w:szCs w:val="16"/>
+              </w:rPr>
+              <w:t>/}{</w:t>
+            </w:r>
+            <w:proofErr w:type="gramEnd"/>
+            <w:r>
+              <w:rPr>
+                <w:rFonts w:ascii="Arial" w:hAnsi="Arial" w:cs="Arial"/>
+                <w:sz w:val="16"/>
+                <w:szCs w:val="16"/>
+              </w:rPr>
+              <w:t>^</w:t>
             </w:r>
             <w:r>
               <w:rPr>
@@ -10206,7 +11666,16 @@
                 <w:sz w:val="16"/>
                 <w:szCs w:val="16"/>
               </w:rPr>
-              <w:t>{/}</w:t>
+              <w:t>{</w:t>
+            </w:r>
+            <w:proofErr w:type="gramStart"/>
+            <w:r>
+              <w:rPr>
+                <w:rFonts w:ascii="Arial" w:hAnsi="Arial" w:cs="Arial"/>
+                <w:sz w:val="16"/>
+                <w:szCs w:val="16"/>
+              </w:rPr>
+              <w:t>/}</w:t>
             </w:r>
             <w:permEnd w:id="1973898477"/>
             <w:r>
@@ -10230,7 +11699,16 @@
                 <w:sz w:val="16"/>
                 <w:szCs w:val="16"/>
               </w:rPr>
-              <w:t xml:space="preserve">Reclassify to General Population  </w:t>
+              <w:t>Reclassify</w:t>
+            </w:r>
+            <w:proofErr w:type="gramEnd"/>
+            <w:r>
+              <w:rPr>
+                <w:rFonts w:ascii="Arial" w:eastAsia="Arial" w:hAnsi="Arial" w:cs="Arial"/>
+                <w:sz w:val="16"/>
+                <w:szCs w:val="16"/>
+              </w:rPr>
+              <w:t xml:space="preserve"> to General Population  </w:t>
             </w:r>
           </w:p>
         </w:tc>
@@ -10307,7 +11785,25 @@
                 <w:sz w:val="16"/>
                 <w:szCs w:val="16"/>
               </w:rPr>
-              <w:t>{/}{^</w:t>
+              <w:t>{</w:t>
+            </w:r>
+            <w:proofErr w:type="gramStart"/>
+            <w:r>
+              <w:rPr>
+                <w:rFonts w:ascii="Arial" w:hAnsi="Arial" w:cs="Arial"/>
+                <w:sz w:val="16"/>
+                <w:szCs w:val="16"/>
+              </w:rPr>
+              <w:t>/}{</w:t>
+            </w:r>
+            <w:proofErr w:type="gramEnd"/>
+            <w:r>
+              <w:rPr>
+                <w:rFonts w:ascii="Arial" w:hAnsi="Arial" w:cs="Arial"/>
+                <w:sz w:val="16"/>
+                <w:szCs w:val="16"/>
+              </w:rPr>
+              <w:t>^</w:t>
             </w:r>
             <w:r>
               <w:rPr>
@@ -10355,7 +11851,16 @@
                 <w:sz w:val="16"/>
                 <w:szCs w:val="16"/>
               </w:rPr>
-              <w:t>{/}</w:t>
+              <w:t>{</w:t>
+            </w:r>
+            <w:proofErr w:type="gramStart"/>
+            <w:r>
+              <w:rPr>
+                <w:rFonts w:ascii="Arial" w:hAnsi="Arial" w:cs="Arial"/>
+                <w:sz w:val="16"/>
+                <w:szCs w:val="16"/>
+              </w:rPr>
+              <w:t>/}</w:t>
             </w:r>
             <w:permEnd w:id="833032897"/>
             <w:r>
@@ -10381,6 +11886,7 @@
               </w:rPr>
               <w:t>Transfer</w:t>
             </w:r>
+            <w:proofErr w:type="gramEnd"/>
           </w:p>
         </w:tc>
         <w:tc>
@@ -10457,7 +11963,25 @@
                 <w:sz w:val="16"/>
                 <w:szCs w:val="16"/>
               </w:rPr>
-              <w:t>{/}{^</w:t>
+              <w:t>{</w:t>
+            </w:r>
+            <w:proofErr w:type="gramStart"/>
+            <w:r>
+              <w:rPr>
+                <w:rFonts w:ascii="Arial" w:hAnsi="Arial" w:cs="Arial"/>
+                <w:sz w:val="16"/>
+                <w:szCs w:val="16"/>
+              </w:rPr>
+              <w:t>/}{</w:t>
+            </w:r>
+            <w:proofErr w:type="gramEnd"/>
+            <w:r>
+              <w:rPr>
+                <w:rFonts w:ascii="Arial" w:hAnsi="Arial" w:cs="Arial"/>
+                <w:sz w:val="16"/>
+                <w:szCs w:val="16"/>
+              </w:rPr>
+              <w:t>^</w:t>
             </w:r>
             <w:r>
               <w:rPr>
@@ -10505,7 +12029,16 @@
                 <w:sz w:val="16"/>
                 <w:szCs w:val="16"/>
               </w:rPr>
-              <w:t>{/}</w:t>
+              <w:t>{</w:t>
+            </w:r>
+            <w:proofErr w:type="gramStart"/>
+            <w:r>
+              <w:rPr>
+                <w:rFonts w:ascii="Arial" w:hAnsi="Arial" w:cs="Arial"/>
+                <w:sz w:val="16"/>
+                <w:szCs w:val="16"/>
+              </w:rPr>
+              <w:t>/}</w:t>
             </w:r>
             <w:permEnd w:id="324541712"/>
             <w:r>
@@ -10531,6 +12064,7 @@
               </w:rPr>
               <w:t>Protection</w:t>
             </w:r>
+            <w:proofErr w:type="gramEnd"/>
           </w:p>
         </w:tc>
       </w:tr>
@@ -11065,16 +12599,26 @@
                 <w:sz w:val="18"/>
                 <w:szCs w:val="18"/>
               </w:rPr>
-              <w:t>{QMHP}</w:t>
-            </w:r>
+              <w:t>{</w:t>
+            </w:r>
+            <w:proofErr w:type="gramStart"/>
             <w:r>
               <w:rPr>
                 <w:rFonts w:ascii="Courier New" w:eastAsia="Courier New" w:hAnsi="Courier New" w:cs="Courier New"/>
                 <w:sz w:val="18"/>
                 <w:szCs w:val="18"/>
               </w:rPr>
+              <w:t>QMHP}</w:t>
+            </w:r>
+            <w:r>
+              <w:rPr>
+                <w:rFonts w:ascii="Courier New" w:eastAsia="Courier New" w:hAnsi="Courier New" w:cs="Courier New"/>
+                <w:sz w:val="18"/>
+                <w:szCs w:val="18"/>
+              </w:rPr>
               <w:t>   </w:t>
             </w:r>
+            <w:proofErr w:type="gramEnd"/>
           </w:p>
         </w:tc>
         <w:tc>
@@ -11262,7 +12806,16 @@
                 <w:sz w:val="16"/>
                 <w:szCs w:val="16"/>
               </w:rPr>
-              <w:t xml:space="preserve">Approve SCC Recommendation?  (If Applicable)  </w:t>
+              <w:t xml:space="preserve">Approve SCC Recommendation?  (If </w:t>
+            </w:r>
+            <w:proofErr w:type="gramStart"/>
+            <w:r>
+              <w:rPr>
+                <w:rFonts w:ascii="Arial" w:eastAsia="Arial" w:hAnsi="Arial" w:cs="Arial"/>
+                <w:sz w:val="16"/>
+                <w:szCs w:val="16"/>
+              </w:rPr>
+              <w:t xml:space="preserve">Applicable)  </w:t>
             </w:r>
             <w:permStart w:id="977688639" w:edGrp="everyone"/>
             <w:r>
@@ -11271,7 +12824,16 @@
                 <w:sz w:val="16"/>
                 <w:szCs w:val="16"/>
               </w:rPr>
-              <w:t>{#</w:t>
+              <w:t>{</w:t>
+            </w:r>
+            <w:proofErr w:type="gramEnd"/>
+            <w:r>
+              <w:rPr>
+                <w:rFonts w:ascii="Arial" w:hAnsi="Arial" w:cs="Arial"/>
+                <w:sz w:val="16"/>
+                <w:szCs w:val="16"/>
+              </w:rPr>
+              <w:t>#</w:t>
             </w:r>
             <w:r>
               <w:rPr>
@@ -11319,7 +12881,25 @@
                 <w:sz w:val="16"/>
                 <w:szCs w:val="16"/>
               </w:rPr>
-              <w:t>{/}{^</w:t>
+              <w:t>{</w:t>
+            </w:r>
+            <w:proofErr w:type="gramStart"/>
+            <w:r>
+              <w:rPr>
+                <w:rFonts w:ascii="Arial" w:hAnsi="Arial" w:cs="Arial"/>
+                <w:sz w:val="16"/>
+                <w:szCs w:val="16"/>
+              </w:rPr>
+              <w:t>/}{</w:t>
+            </w:r>
+            <w:proofErr w:type="gramEnd"/>
+            <w:r>
+              <w:rPr>
+                <w:rFonts w:ascii="Arial" w:hAnsi="Arial" w:cs="Arial"/>
+                <w:sz w:val="16"/>
+                <w:szCs w:val="16"/>
+              </w:rPr>
+              <w:t>^</w:t>
             </w:r>
             <w:proofErr w:type="spellStart"/>
             <w:r>
@@ -11385,7 +12965,16 @@
                 <w:sz w:val="16"/>
                 <w:szCs w:val="16"/>
               </w:rPr>
-              <w:t xml:space="preserve">Yes    </w:t>
+              <w:t xml:space="preserve">Yes </w:t>
+            </w:r>
+            <w:proofErr w:type="gramStart"/>
+            <w:r>
+              <w:rPr>
+                <w:rFonts w:ascii="Arial" w:eastAsia="Arial" w:hAnsi="Arial" w:cs="Arial"/>
+                <w:sz w:val="16"/>
+                <w:szCs w:val="16"/>
+              </w:rPr>
+              <w:t xml:space="preserve">   </w:t>
             </w:r>
             <w:permStart w:id="384264139" w:edGrp="everyone"/>
             <w:r>
@@ -11396,6 +12985,7 @@
               </w:rPr>
               <w:t>{</w:t>
             </w:r>
+            <w:proofErr w:type="gramEnd"/>
             <w:r>
               <w:rPr>
                 <w:rFonts w:ascii="Arial" w:hAnsi="Arial" w:cs="Arial"/>
@@ -11460,8 +13050,18 @@
                 <w:sz w:val="16"/>
                 <w:szCs w:val="16"/>
               </w:rPr>
-              <w:t>{/}{</w:t>
-            </w:r>
+              <w:t>{</w:t>
+            </w:r>
+            <w:proofErr w:type="gramStart"/>
+            <w:r>
+              <w:rPr>
+                <w:rFonts w:ascii="Arial" w:hAnsi="Arial" w:cs="Arial"/>
+                <w:sz w:val="16"/>
+                <w:szCs w:val="16"/>
+              </w:rPr>
+              <w:t>/}{</w:t>
+            </w:r>
+            <w:proofErr w:type="gramEnd"/>
             <w:r>
               <w:rPr>
                 <w:rFonts w:ascii="Arial" w:hAnsi="Arial" w:cs="Arial"/>
@@ -11524,7 +13124,16 @@
                 <w:sz w:val="16"/>
                 <w:szCs w:val="16"/>
               </w:rPr>
-              <w:t>{/}</w:t>
+              <w:t>{</w:t>
+            </w:r>
+            <w:proofErr w:type="gramStart"/>
+            <w:r>
+              <w:rPr>
+                <w:rFonts w:ascii="Arial" w:hAnsi="Arial" w:cs="Arial"/>
+                <w:sz w:val="16"/>
+                <w:szCs w:val="16"/>
+              </w:rPr>
+              <w:t>/}</w:t>
             </w:r>
             <w:permEnd w:id="384264139"/>
             <w:r>
@@ -11542,6 +13151,7 @@
               </w:rPr>
               <w:t xml:space="preserve"> No</w:t>
             </w:r>
+            <w:proofErr w:type="gramEnd"/>
           </w:p>
         </w:tc>
         <w:tc>
@@ -11778,7 +13388,25 @@
                 <w:sz w:val="16"/>
                 <w:szCs w:val="16"/>
               </w:rPr>
-              <w:t>{/}{^</w:t>
+              <w:t>{</w:t>
+            </w:r>
+            <w:proofErr w:type="gramStart"/>
+            <w:r>
+              <w:rPr>
+                <w:rFonts w:ascii="Arial" w:hAnsi="Arial" w:cs="Arial"/>
+                <w:sz w:val="16"/>
+                <w:szCs w:val="16"/>
+              </w:rPr>
+              <w:t>/}{</w:t>
+            </w:r>
+            <w:proofErr w:type="gramEnd"/>
+            <w:r>
+              <w:rPr>
+                <w:rFonts w:ascii="Arial" w:hAnsi="Arial" w:cs="Arial"/>
+                <w:sz w:val="16"/>
+                <w:szCs w:val="16"/>
+              </w:rPr>
+              <w:t>^</w:t>
             </w:r>
             <w:proofErr w:type="spellStart"/>
             <w:r>
@@ -11828,7 +13456,16 @@
                 <w:sz w:val="16"/>
                 <w:szCs w:val="16"/>
               </w:rPr>
-              <w:t>{/}</w:t>
+              <w:t>{</w:t>
+            </w:r>
+            <w:proofErr w:type="gramStart"/>
+            <w:r>
+              <w:rPr>
+                <w:rFonts w:ascii="Arial" w:hAnsi="Arial" w:cs="Arial"/>
+                <w:sz w:val="16"/>
+                <w:szCs w:val="16"/>
+              </w:rPr>
+              <w:t>/}</w:t>
             </w:r>
             <w:permEnd w:id="1974237978"/>
             <w:r>
@@ -11844,7 +13481,16 @@
                 <w:sz w:val="16"/>
                 <w:szCs w:val="16"/>
               </w:rPr>
-              <w:t xml:space="preserve"> Warden (6 months)</w:t>
+              <w:t xml:space="preserve"> Warden</w:t>
+            </w:r>
+            <w:proofErr w:type="gramEnd"/>
+            <w:r>
+              <w:rPr>
+                <w:rFonts w:ascii="Arial" w:eastAsia="Arial" w:hAnsi="Arial" w:cs="Arial"/>
+                <w:sz w:val="16"/>
+                <w:szCs w:val="16"/>
+              </w:rPr>
+              <w:t xml:space="preserve"> (6 months)</w:t>
             </w:r>
           </w:p>
         </w:tc>
@@ -12021,7 +13667,25 @@
                 <w:sz w:val="16"/>
                 <w:szCs w:val="16"/>
               </w:rPr>
-              <w:t>{/}{^</w:t>
+              <w:t>{</w:t>
+            </w:r>
+            <w:proofErr w:type="gramStart"/>
+            <w:r>
+              <w:rPr>
+                <w:rFonts w:ascii="Arial" w:hAnsi="Arial" w:cs="Arial"/>
+                <w:sz w:val="16"/>
+                <w:szCs w:val="16"/>
+              </w:rPr>
+              <w:t>/}{</w:t>
+            </w:r>
+            <w:proofErr w:type="gramEnd"/>
+            <w:r>
+              <w:rPr>
+                <w:rFonts w:ascii="Arial" w:hAnsi="Arial" w:cs="Arial"/>
+                <w:sz w:val="16"/>
+                <w:szCs w:val="16"/>
+              </w:rPr>
+              <w:t>^</w:t>
             </w:r>
             <w:proofErr w:type="spellStart"/>
             <w:r>
@@ -12071,7 +13735,16 @@
                 <w:sz w:val="16"/>
                 <w:szCs w:val="16"/>
               </w:rPr>
-              <w:t>{/}</w:t>
+              <w:t>{</w:t>
+            </w:r>
+            <w:proofErr w:type="gramStart"/>
+            <w:r>
+              <w:rPr>
+                <w:rFonts w:ascii="Arial" w:hAnsi="Arial" w:cs="Arial"/>
+                <w:sz w:val="16"/>
+                <w:szCs w:val="16"/>
+              </w:rPr>
+              <w:t>/}</w:t>
             </w:r>
             <w:permEnd w:id="1625243947"/>
             <w:r>
@@ -12095,7 +13768,16 @@
                 <w:sz w:val="16"/>
                 <w:szCs w:val="16"/>
               </w:rPr>
-              <w:t>ADD (Annual)</w:t>
+              <w:t>ADD</w:t>
+            </w:r>
+            <w:proofErr w:type="gramEnd"/>
+            <w:r>
+              <w:rPr>
+                <w:rFonts w:ascii="Arial" w:eastAsia="Arial" w:hAnsi="Arial" w:cs="Arial"/>
+                <w:sz w:val="16"/>
+                <w:szCs w:val="16"/>
+              </w:rPr>
+              <w:t xml:space="preserve"> (Annual)</w:t>
             </w:r>
           </w:p>
         </w:tc>
@@ -12840,7 +14522,7 @@
 </file>
 
 <file path=word/endnotes.xml><?xml version="1.0" encoding="utf-8"?>
-<w:endnotes xmlns:wpc="http://schemas.microsoft.com/office/word/2010/wordprocessingCanvas" xmlns:cx="http://schemas.microsoft.com/office/drawing/2014/chartex" xmlns:cx1="http://schemas.microsoft.com/office/drawing/2015/9/8/chartex" xmlns:cx2="http://schemas.microsoft.com/office/drawing/2015/10/21/chartex" xmlns:cx3="http://schemas.microsoft.com/office/drawing/2016/5/9/chartex" xmlns:cx4="http://schemas.microsoft.com/office/drawing/2016/5/10/chartex" xmlns:cx5="http://schemas.microsoft.com/office/drawing/2016/5/11/chartex" xmlns:cx6="http://schemas.microsoft.com/office/drawing/2016/5/12/chartex" xmlns:cx7="http://schemas.microsoft.com/office/drawing/2016/5/13/chartex" xmlns:cx8="http://schemas.microsoft.com/office/drawing/2016/5/14/chartex" xmlns:mc="http://schemas.openxmlformats.org/markup-compatibility/2006" xmlns:aink="http://schemas.microsoft.com/office/drawing/2016/ink" xmlns:am3d="http://schemas.microsoft.com/office/drawing/2017/model3d" xmlns:o="urn:schemas-microsoft-com:office:office" xmlns:oel="http://schemas.microsoft.com/office/2019/extlst" xmlns:r="http://schemas.openxmlformats.org/officeDocument/2006/relationships" xmlns:m="http://schemas.openxmlformats.org/officeDocument/2006/math" xmlns:v="urn:schemas-microsoft-com:vml" xmlns:wp14="http://schemas.microsoft.com/office/word/2010/wordprocessingDrawing" xmlns:wp="http://schemas.openxmlformats.org/drawingml/2006/wordprocessingDrawing" xmlns:w10="urn:schemas-microsoft-com:office:word" xmlns:w="http://schemas.openxmlformats.org/wordprocessingml/2006/main" xmlns:w14="http://schemas.microsoft.com/office/word/2010/wordml" xmlns:w15="http://schemas.microsoft.com/office/word/2012/wordml" xmlns:w16cex="http://schemas.microsoft.com/office/word/2018/wordml/cex" xmlns:w16cid="http://schemas.microsoft.com/office/word/2016/wordml/cid" xmlns:w16="http://schemas.microsoft.com/office/word/2018/wordml" xmlns:w16sdtdh="http://schemas.microsoft.com/office/word/2020/wordml/sdtdatahash" xmlns:w16se="http://schemas.microsoft.com/office/word/2015/wordml/symex" xmlns:wpg="http://schemas.microsoft.com/office/word/2010/wordprocessingGroup" xmlns:wpi="http://schemas.microsoft.com/office/word/2010/wordprocessingInk" xmlns:wne="http://schemas.microsoft.com/office/word/2006/wordml" xmlns:wps="http://schemas.microsoft.com/office/word/2010/wordprocessingShape" mc:Ignorable="w14 w15 w16se w16cid w16 w16cex w16sdtdh wp14">
+<w:endnotes xmlns:wpc="http://schemas.microsoft.com/office/word/2010/wordprocessingCanvas" xmlns:cx="http://schemas.microsoft.com/office/drawing/2014/chartex" xmlns:cx1="http://schemas.microsoft.com/office/drawing/2015/9/8/chartex" xmlns:cx2="http://schemas.microsoft.com/office/drawing/2015/10/21/chartex" xmlns:cx3="http://schemas.microsoft.com/office/drawing/2016/5/9/chartex" xmlns:cx4="http://schemas.microsoft.com/office/drawing/2016/5/10/chartex" xmlns:cx5="http://schemas.microsoft.com/office/drawing/2016/5/11/chartex" xmlns:cx6="http://schemas.microsoft.com/office/drawing/2016/5/12/chartex" xmlns:cx7="http://schemas.microsoft.com/office/drawing/2016/5/13/chartex" xmlns:cx8="http://schemas.microsoft.com/office/drawing/2016/5/14/chartex" xmlns:mc="http://schemas.openxmlformats.org/markup-compatibility/2006" xmlns:aink="http://schemas.microsoft.com/office/drawing/2016/ink" xmlns:am3d="http://schemas.microsoft.com/office/drawing/2017/model3d" xmlns:o="urn:schemas-microsoft-com:office:office" xmlns:oel="http://schemas.microsoft.com/office/2019/extlst" xmlns:r="http://schemas.openxmlformats.org/officeDocument/2006/relationships" xmlns:m="http://schemas.openxmlformats.org/officeDocument/2006/math" xmlns:v="urn:schemas-microsoft-com:vml" xmlns:wp14="http://schemas.microsoft.com/office/word/2010/wordprocessingDrawing" xmlns:wp="http://schemas.openxmlformats.org/drawingml/2006/wordprocessingDrawing" xmlns:w10="urn:schemas-microsoft-com:office:word" xmlns:w="http://schemas.openxmlformats.org/wordprocessingml/2006/main" xmlns:w14="http://schemas.microsoft.com/office/word/2010/wordml" xmlns:w15="http://schemas.microsoft.com/office/word/2012/wordml" xmlns:w16cex="http://schemas.microsoft.com/office/word/2018/wordml/cex" xmlns:w16cid="http://schemas.microsoft.com/office/word/2016/wordml/cid" xmlns:w16="http://schemas.microsoft.com/office/word/2018/wordml" xmlns:w16du="http://schemas.microsoft.com/office/word/2023/wordml/word16du" xmlns:w16sdtdh="http://schemas.microsoft.com/office/word/2020/wordml/sdtdatahash" xmlns:w16sdtfl="http://schemas.microsoft.com/office/word/2024/wordml/sdtformatlock" xmlns:w16se="http://schemas.microsoft.com/office/word/2015/wordml/symex" xmlns:wpg="http://schemas.microsoft.com/office/word/2010/wordprocessingGroup" xmlns:wpi="http://schemas.microsoft.com/office/word/2010/wordprocessingInk" xmlns:wne="http://schemas.microsoft.com/office/word/2006/wordml" xmlns:wps="http://schemas.microsoft.com/office/word/2010/wordprocessingShape" mc:Ignorable="w14 w15 w16se w16cid w16 w16cex w16sdtdh w16sdtfl w16du wp14">
   <w:endnote w:type="separator" w:id="-1">
     <w:p>
       <w:r>
@@ -12859,7 +14541,7 @@
 </file>
 
 <file path=word/footnotes.xml><?xml version="1.0" encoding="utf-8"?>
-<w:footnotes xmlns:wpc="http://schemas.microsoft.com/office/word/2010/wordprocessingCanvas" xmlns:cx="http://schemas.microsoft.com/office/drawing/2014/chartex" xmlns:cx1="http://schemas.microsoft.com/office/drawing/2015/9/8/chartex" xmlns:cx2="http://schemas.microsoft.com/office/drawing/2015/10/21/chartex" xmlns:cx3="http://schemas.microsoft.com/office/drawing/2016/5/9/chartex" xmlns:cx4="http://schemas.microsoft.com/office/drawing/2016/5/10/chartex" xmlns:cx5="http://schemas.microsoft.com/office/drawing/2016/5/11/chartex" xmlns:cx6="http://schemas.microsoft.com/office/drawing/2016/5/12/chartex" xmlns:cx7="http://schemas.microsoft.com/office/drawing/2016/5/13/chartex" xmlns:cx8="http://schemas.microsoft.com/office/drawing/2016/5/14/chartex" xmlns:mc="http://schemas.openxmlformats.org/markup-compatibility/2006" xmlns:aink="http://schemas.microsoft.com/office/drawing/2016/ink" xmlns:am3d="http://schemas.microsoft.com/office/drawing/2017/model3d" xmlns:o="urn:schemas-microsoft-com:office:office" xmlns:oel="http://schemas.microsoft.com/office/2019/extlst" xmlns:r="http://schemas.openxmlformats.org/officeDocument/2006/relationships" xmlns:m="http://schemas.openxmlformats.org/officeDocument/2006/math" xmlns:v="urn:schemas-microsoft-com:vml" xmlns:wp14="http://schemas.microsoft.com/office/word/2010/wordprocessingDrawing" xmlns:wp="http://schemas.openxmlformats.org/drawingml/2006/wordprocessingDrawing" xmlns:w10="urn:schemas-microsoft-com:office:word" xmlns:w="http://schemas.openxmlformats.org/wordprocessingml/2006/main" xmlns:w14="http://schemas.microsoft.com/office/word/2010/wordml" xmlns:w15="http://schemas.microsoft.com/office/word/2012/wordml" xmlns:w16cex="http://schemas.microsoft.com/office/word/2018/wordml/cex" xmlns:w16cid="http://schemas.microsoft.com/office/word/2016/wordml/cid" xmlns:w16="http://schemas.microsoft.com/office/word/2018/wordml" xmlns:w16sdtdh="http://schemas.microsoft.com/office/word/2020/wordml/sdtdatahash" xmlns:w16se="http://schemas.microsoft.com/office/word/2015/wordml/symex" xmlns:wpg="http://schemas.microsoft.com/office/word/2010/wordprocessingGroup" xmlns:wpi="http://schemas.microsoft.com/office/word/2010/wordprocessingInk" xmlns:wne="http://schemas.microsoft.com/office/word/2006/wordml" xmlns:wps="http://schemas.microsoft.com/office/word/2010/wordprocessingShape" mc:Ignorable="w14 w15 w16se w16cid w16 w16cex w16sdtdh wp14">
+<w:footnotes xmlns:wpc="http://schemas.microsoft.com/office/word/2010/wordprocessingCanvas" xmlns:cx="http://schemas.microsoft.com/office/drawing/2014/chartex" xmlns:cx1="http://schemas.microsoft.com/office/drawing/2015/9/8/chartex" xmlns:cx2="http://schemas.microsoft.com/office/drawing/2015/10/21/chartex" xmlns:cx3="http://schemas.microsoft.com/office/drawing/2016/5/9/chartex" xmlns:cx4="http://schemas.microsoft.com/office/drawing/2016/5/10/chartex" xmlns:cx5="http://schemas.microsoft.com/office/drawing/2016/5/11/chartex" xmlns:cx6="http://schemas.microsoft.com/office/drawing/2016/5/12/chartex" xmlns:cx7="http://schemas.microsoft.com/office/drawing/2016/5/13/chartex" xmlns:cx8="http://schemas.microsoft.com/office/drawing/2016/5/14/chartex" xmlns:mc="http://schemas.openxmlformats.org/markup-compatibility/2006" xmlns:aink="http://schemas.microsoft.com/office/drawing/2016/ink" xmlns:am3d="http://schemas.microsoft.com/office/drawing/2017/model3d" xmlns:o="urn:schemas-microsoft-com:office:office" xmlns:oel="http://schemas.microsoft.com/office/2019/extlst" xmlns:r="http://schemas.openxmlformats.org/officeDocument/2006/relationships" xmlns:m="http://schemas.openxmlformats.org/officeDocument/2006/math" xmlns:v="urn:schemas-microsoft-com:vml" xmlns:wp14="http://schemas.microsoft.com/office/word/2010/wordprocessingDrawing" xmlns:wp="http://schemas.openxmlformats.org/drawingml/2006/wordprocessingDrawing" xmlns:w10="urn:schemas-microsoft-com:office:word" xmlns:w="http://schemas.openxmlformats.org/wordprocessingml/2006/main" xmlns:w14="http://schemas.microsoft.com/office/word/2010/wordml" xmlns:w15="http://schemas.microsoft.com/office/word/2012/wordml" xmlns:w16cex="http://schemas.microsoft.com/office/word/2018/wordml/cex" xmlns:w16cid="http://schemas.microsoft.com/office/word/2016/wordml/cid" xmlns:w16="http://schemas.microsoft.com/office/word/2018/wordml" xmlns:w16du="http://schemas.microsoft.com/office/word/2023/wordml/word16du" xmlns:w16sdtdh="http://schemas.microsoft.com/office/word/2020/wordml/sdtdatahash" xmlns:w16sdtfl="http://schemas.microsoft.com/office/word/2024/wordml/sdtformatlock" xmlns:w16se="http://schemas.microsoft.com/office/word/2015/wordml/symex" xmlns:wpg="http://schemas.microsoft.com/office/word/2010/wordprocessingGroup" xmlns:wpi="http://schemas.microsoft.com/office/word/2010/wordprocessingInk" xmlns:wne="http://schemas.microsoft.com/office/word/2006/wordml" xmlns:wps="http://schemas.microsoft.com/office/word/2010/wordprocessingShape" mc:Ignorable="w14 w15 w16se w16cid w16 w16cex w16sdtdh w16sdtfl w16du wp14">
   <w:footnote w:type="separator" w:id="-1">
     <w:p>
       <w:r>
@@ -12878,7 +14560,7 @@
 </file>
 
 <file path=word/styles.xml><?xml version="1.0" encoding="utf-8"?>
-<w:styles xmlns:mc="http://schemas.openxmlformats.org/markup-compatibility/2006" xmlns:r="http://schemas.openxmlformats.org/officeDocument/2006/relationships" xmlns:w="http://schemas.openxmlformats.org/wordprocessingml/2006/main" xmlns:w14="http://schemas.microsoft.com/office/word/2010/wordml" xmlns:w15="http://schemas.microsoft.com/office/word/2012/wordml" xmlns:w16cex="http://schemas.microsoft.com/office/word/2018/wordml/cex" xmlns:w16cid="http://schemas.microsoft.com/office/word/2016/wordml/cid" xmlns:w16="http://schemas.microsoft.com/office/word/2018/wordml" xmlns:w16sdtdh="http://schemas.microsoft.com/office/word/2020/wordml/sdtdatahash" xmlns:w16se="http://schemas.microsoft.com/office/word/2015/wordml/symex" mc:Ignorable="w14 w15 w16se w16cid w16 w16cex w16sdtdh">
+<w:styles xmlns:mc="http://schemas.openxmlformats.org/markup-compatibility/2006" xmlns:r="http://schemas.openxmlformats.org/officeDocument/2006/relationships" xmlns:w="http://schemas.openxmlformats.org/wordprocessingml/2006/main" xmlns:w14="http://schemas.microsoft.com/office/word/2010/wordml" xmlns:w15="http://schemas.microsoft.com/office/word/2012/wordml" xmlns:w16cex="http://schemas.microsoft.com/office/word/2018/wordml/cex" xmlns:w16cid="http://schemas.microsoft.com/office/word/2016/wordml/cid" xmlns:w16="http://schemas.microsoft.com/office/word/2018/wordml" xmlns:w16du="http://schemas.microsoft.com/office/word/2023/wordml/word16du" xmlns:w16sdtdh="http://schemas.microsoft.com/office/word/2020/wordml/sdtdatahash" xmlns:w16sdtfl="http://schemas.microsoft.com/office/word/2024/wordml/sdtformatlock" xmlns:w16se="http://schemas.microsoft.com/office/word/2015/wordml/symex" mc:Ignorable="w14 w15 w16se w16cid w16 w16cex w16sdtdh w16sdtfl w16du">
   <w:docDefaults>
     <w:rPrDefault>
       <w:rPr>

</xml_diff>